<commit_message>
docs: validar modelo de custos operacionais com a arquitetura cloud v2.4 do Detalhamento_Custos_Infraestrutura_Cloud_Netfits.docx
</commit_message>
<xml_diff>
--- a/docs/estimativa_custos_operacionais_1M_usuarios_netfits.docx
+++ b/docs/estimativa_custos_operacionais_1M_usuarios_netfits.docx
@@ -29,7 +29,7 @@
           <w:color w:val="71717A"/>
           <w:sz w:val="20"/>
         </w:rPr>
-        <w:t>Netfits Fidelidade Ltda. — Modelo de Custos com Evolução Mensal</w:t>
+        <w:t>Netfits Fidelidade Ltda. — Validação com Modelo Cloud v2.4 (Detalhamento_Custos_Infraestrutura_Cloud_Netfits.docx)</w:t>
         <w:br/>
         <w:t>Base: Business Case - v1.xlsx (Aba receitas, Linha 3: 100 em Out/26 a 500k em Dez/27 -&gt; 2,5M em 2030)</w:t>
       </w:r>
@@ -57,17 +57,18 @@
         <w:tblLook w:firstColumn="1" w:firstRow="1" w:lastColumn="0" w:lastRow="0" w:noHBand="0" w:noVBand="1" w:val="04A0"/>
       </w:tblPr>
       <w:tblGrid>
-        <w:gridCol w:w="1656"/>
-        <w:gridCol w:w="1656"/>
-        <w:gridCol w:w="1656"/>
-        <w:gridCol w:w="1656"/>
-        <w:gridCol w:w="1656"/>
-        <w:gridCol w:w="1656"/>
+        <w:gridCol w:w="1419"/>
+        <w:gridCol w:w="1419"/>
+        <w:gridCol w:w="1419"/>
+        <w:gridCol w:w="1419"/>
+        <w:gridCol w:w="1419"/>
+        <w:gridCol w:w="1419"/>
+        <w:gridCol w:w="1419"/>
       </w:tblGrid>
       <w:tr>
         <w:tc>
           <w:tcPr>
-            <w:tcW w:type="dxa" w:w="1656"/>
+            <w:tcW w:type="dxa" w:w="1419"/>
             <w:shd w:fill="9333EA"/>
           </w:tcPr>
           <w:p>
@@ -80,7 +81,7 @@
                 <w:b/>
                 <w:i w:val="0"/>
                 <w:color w:val="FFFFFF"/>
-                <w:sz w:val="18"/>
+                <w:sz w:val="17"/>
               </w:rPr>
               <w:t>Mês</w:t>
             </w:r>
@@ -88,7 +89,7 @@
         </w:tc>
         <w:tc>
           <w:tcPr>
-            <w:tcW w:type="dxa" w:w="1656"/>
+            <w:tcW w:type="dxa" w:w="1419"/>
             <w:shd w:fill="9333EA"/>
           </w:tcPr>
           <w:p>
@@ -101,7 +102,7 @@
                 <w:b/>
                 <w:i w:val="0"/>
                 <w:color w:val="FFFFFF"/>
-                <w:sz w:val="18"/>
+                <w:sz w:val="17"/>
               </w:rPr>
               <w:t>Usuários Ativos</w:t>
             </w:r>
@@ -109,7 +110,7 @@
         </w:tc>
         <w:tc>
           <w:tcPr>
-            <w:tcW w:type="dxa" w:w="1656"/>
+            <w:tcW w:type="dxa" w:w="1419"/>
             <w:shd w:fill="9333EA"/>
           </w:tcPr>
           <w:p>
@@ -122,15 +123,15 @@
                 <w:b/>
                 <w:i w:val="0"/>
                 <w:color w:val="FFFFFF"/>
-                <w:sz w:val="18"/>
+                <w:sz w:val="17"/>
               </w:rPr>
-              <w:t>Custos Diretos (CSP)</w:t>
+              <w:t>Cloud v2.4</w:t>
             </w:r>
           </w:p>
         </w:tc>
         <w:tc>
           <w:tcPr>
-            <w:tcW w:type="dxa" w:w="1656"/>
+            <w:tcW w:type="dxa" w:w="1419"/>
             <w:shd w:fill="9333EA"/>
           </w:tcPr>
           <w:p>
@@ -143,15 +144,15 @@
                 <w:b/>
                 <w:i w:val="0"/>
                 <w:color w:val="FFFFFF"/>
-                <w:sz w:val="18"/>
+                <w:sz w:val="17"/>
               </w:rPr>
-              <w:t>OPEX (Equipe/MKT)</w:t>
+              <w:t>Custos Diretos (CSP)</w:t>
             </w:r>
           </w:p>
         </w:tc>
         <w:tc>
           <w:tcPr>
-            <w:tcW w:type="dxa" w:w="1656"/>
+            <w:tcW w:type="dxa" w:w="1419"/>
             <w:shd w:fill="9333EA"/>
           </w:tcPr>
           <w:p>
@@ -164,15 +165,15 @@
                 <w:b/>
                 <w:i w:val="0"/>
                 <w:color w:val="FFFFFF"/>
-                <w:sz w:val="18"/>
+                <w:sz w:val="17"/>
               </w:rPr>
-              <w:t>Custo Total Mensal</w:t>
+              <w:t>OPEX (Equipe/MKT)</w:t>
             </w:r>
           </w:p>
         </w:tc>
         <w:tc>
           <w:tcPr>
-            <w:tcW w:type="dxa" w:w="1656"/>
+            <w:tcW w:type="dxa" w:w="1419"/>
             <w:shd w:fill="9333EA"/>
           </w:tcPr>
           <w:p>
@@ -185,7 +186,28 @@
                 <w:b/>
                 <w:i w:val="0"/>
                 <w:color w:val="FFFFFF"/>
-                <w:sz w:val="18"/>
+                <w:sz w:val="17"/>
+              </w:rPr>
+              <w:t>Custo Total Mensal</w:t>
+            </w:r>
+          </w:p>
+        </w:tc>
+        <w:tc>
+          <w:tcPr>
+            <w:tcW w:type="dxa" w:w="1419"/>
+            <w:shd w:fill="9333EA"/>
+          </w:tcPr>
+          <w:p>
+            <w:pPr>
+              <w:jc w:val="left"/>
+            </w:pPr>
+            <w:r>
+              <w:rPr>
+                <w:rFonts w:ascii="Calibri" w:hAnsi="Calibri"/>
+                <w:b/>
+                <w:i w:val="0"/>
+                <w:color w:val="FFFFFF"/>
+                <w:sz w:val="17"/>
               </w:rPr>
               <w:t>Custo / Usuário</w:t>
             </w:r>
@@ -195,7 +217,7 @@
       <w:tr>
         <w:tc>
           <w:tcPr>
-            <w:tcW w:type="dxa" w:w="1656"/>
+            <w:tcW w:type="dxa" w:w="1419"/>
             <w:shd w:fill="F4F4F5"/>
           </w:tcPr>
           <w:p>
@@ -208,7 +230,7 @@
                 <w:b w:val="0"/>
                 <w:i w:val="0"/>
                 <w:color w:val="18181B"/>
-                <w:sz w:val="18"/>
+                <w:sz w:val="17"/>
               </w:rPr>
               <w:t>Out/26</w:t>
             </w:r>
@@ -216,7 +238,7 @@
         </w:tc>
         <w:tc>
           <w:tcPr>
-            <w:tcW w:type="dxa" w:w="1656"/>
+            <w:tcW w:type="dxa" w:w="1419"/>
             <w:shd w:fill="F4F4F5"/>
           </w:tcPr>
           <w:p>
@@ -229,7 +251,7 @@
                 <w:b w:val="0"/>
                 <w:i w:val="0"/>
                 <w:color w:val="18181B"/>
-                <w:sz w:val="18"/>
+                <w:sz w:val="17"/>
               </w:rPr>
               <w:t>100</w:t>
             </w:r>
@@ -237,7 +259,7 @@
         </w:tc>
         <w:tc>
           <w:tcPr>
-            <w:tcW w:type="dxa" w:w="1656"/>
+            <w:tcW w:type="dxa" w:w="1419"/>
             <w:shd w:fill="F4F4F5"/>
           </w:tcPr>
           <w:p>
@@ -250,15 +272,15 @@
                 <w:b w:val="0"/>
                 <w:i w:val="0"/>
                 <w:color w:val="18181B"/>
-                <w:sz w:val="18"/>
+                <w:sz w:val="17"/>
               </w:rPr>
-              <w:t>R$ 450.00</w:t>
+              <w:t>R$ 2,500.00</w:t>
             </w:r>
           </w:p>
         </w:tc>
         <w:tc>
           <w:tcPr>
-            <w:tcW w:type="dxa" w:w="1656"/>
+            <w:tcW w:type="dxa" w:w="1419"/>
             <w:shd w:fill="F4F4F5"/>
           </w:tcPr>
           <w:p>
@@ -271,15 +293,15 @@
                 <w:b w:val="0"/>
                 <w:i w:val="0"/>
                 <w:color w:val="18181B"/>
-                <w:sz w:val="18"/>
+                <w:sz w:val="17"/>
               </w:rPr>
-              <w:t>R$ 54,000.00</w:t>
+              <w:t>R$ 2,600.00</w:t>
             </w:r>
           </w:p>
         </w:tc>
         <w:tc>
           <w:tcPr>
-            <w:tcW w:type="dxa" w:w="1656"/>
+            <w:tcW w:type="dxa" w:w="1419"/>
             <w:shd w:fill="F4F4F5"/>
           </w:tcPr>
           <w:p>
@@ -292,15 +314,15 @@
                 <w:b w:val="0"/>
                 <w:i w:val="0"/>
                 <w:color w:val="18181B"/>
-                <w:sz w:val="18"/>
+                <w:sz w:val="17"/>
               </w:rPr>
-              <w:t>R$ 54,450.00</w:t>
+              <w:t>R$ 54,000.00</w:t>
             </w:r>
           </w:p>
         </w:tc>
         <w:tc>
           <w:tcPr>
-            <w:tcW w:type="dxa" w:w="1656"/>
+            <w:tcW w:type="dxa" w:w="1419"/>
             <w:shd w:fill="F4F4F5"/>
           </w:tcPr>
           <w:p>
@@ -313,139 +335,15 @@
                 <w:b w:val="0"/>
                 <w:i w:val="0"/>
                 <w:color w:val="18181B"/>
-                <w:sz w:val="18"/>
+                <w:sz w:val="17"/>
               </w:rPr>
-              <w:t>R$ 544.50</w:t>
-            </w:r>
-          </w:p>
-        </w:tc>
-      </w:tr>
-      <w:tr>
-        <w:tc>
-          <w:tcPr>
-            <w:tcW w:type="dxa" w:w="1656"/>
-          </w:tcPr>
-          <w:p>
-            <w:pPr>
-              <w:jc w:val="left"/>
-            </w:pPr>
-            <w:r>
-              <w:rPr>
-                <w:rFonts w:ascii="Calibri" w:hAnsi="Calibri"/>
-                <w:b w:val="0"/>
-                <w:i w:val="0"/>
-                <w:color w:val="18181B"/>
-                <w:sz w:val="18"/>
-              </w:rPr>
-              <w:t>Nov/26</w:t>
+              <w:t>R$ 56,600.00</w:t>
             </w:r>
           </w:p>
         </w:tc>
         <w:tc>
           <w:tcPr>
-            <w:tcW w:type="dxa" w:w="1656"/>
-          </w:tcPr>
-          <w:p>
-            <w:pPr>
-              <w:jc w:val="left"/>
-            </w:pPr>
-            <w:r>
-              <w:rPr>
-                <w:rFonts w:ascii="Calibri" w:hAnsi="Calibri"/>
-                <w:b w:val="0"/>
-                <w:i w:val="0"/>
-                <w:color w:val="18181B"/>
-                <w:sz w:val="18"/>
-              </w:rPr>
-              <w:t>1,000</w:t>
-            </w:r>
-          </w:p>
-        </w:tc>
-        <w:tc>
-          <w:tcPr>
-            <w:tcW w:type="dxa" w:w="1656"/>
-          </w:tcPr>
-          <w:p>
-            <w:pPr>
-              <w:jc w:val="left"/>
-            </w:pPr>
-            <w:r>
-              <w:rPr>
-                <w:rFonts w:ascii="Calibri" w:hAnsi="Calibri"/>
-                <w:b w:val="0"/>
-                <w:i w:val="0"/>
-                <w:color w:val="18181B"/>
-                <w:sz w:val="18"/>
-              </w:rPr>
-              <w:t>R$ 450.00</w:t>
-            </w:r>
-          </w:p>
-        </w:tc>
-        <w:tc>
-          <w:tcPr>
-            <w:tcW w:type="dxa" w:w="1656"/>
-          </w:tcPr>
-          <w:p>
-            <w:pPr>
-              <w:jc w:val="left"/>
-            </w:pPr>
-            <w:r>
-              <w:rPr>
-                <w:rFonts w:ascii="Calibri" w:hAnsi="Calibri"/>
-                <w:b w:val="0"/>
-                <w:i w:val="0"/>
-                <w:color w:val="18181B"/>
-                <w:sz w:val="18"/>
-              </w:rPr>
-              <w:t>R$ 54,000.00</w:t>
-            </w:r>
-          </w:p>
-        </w:tc>
-        <w:tc>
-          <w:tcPr>
-            <w:tcW w:type="dxa" w:w="1656"/>
-          </w:tcPr>
-          <w:p>
-            <w:pPr>
-              <w:jc w:val="left"/>
-            </w:pPr>
-            <w:r>
-              <w:rPr>
-                <w:rFonts w:ascii="Calibri" w:hAnsi="Calibri"/>
-                <w:b w:val="0"/>
-                <w:i w:val="0"/>
-                <w:color w:val="18181B"/>
-                <w:sz w:val="18"/>
-              </w:rPr>
-              <w:t>R$ 54,450.00</w:t>
-            </w:r>
-          </w:p>
-        </w:tc>
-        <w:tc>
-          <w:tcPr>
-            <w:tcW w:type="dxa" w:w="1656"/>
-          </w:tcPr>
-          <w:p>
-            <w:pPr>
-              <w:jc w:val="left"/>
-            </w:pPr>
-            <w:r>
-              <w:rPr>
-                <w:rFonts w:ascii="Calibri" w:hAnsi="Calibri"/>
-                <w:b w:val="0"/>
-                <w:i w:val="0"/>
-                <w:color w:val="18181B"/>
-                <w:sz w:val="18"/>
-              </w:rPr>
-              <w:t>R$ 54.45</w:t>
-            </w:r>
-          </w:p>
-        </w:tc>
-      </w:tr>
-      <w:tr>
-        <w:tc>
-          <w:tcPr>
-            <w:tcW w:type="dxa" w:w="1656"/>
+            <w:tcW w:type="dxa" w:w="1419"/>
             <w:shd w:fill="F4F4F5"/>
           </w:tcPr>
           <w:p>
@@ -458,15 +356,159 @@
                 <w:b w:val="0"/>
                 <w:i w:val="0"/>
                 <w:color w:val="18181B"/>
-                <w:sz w:val="18"/>
+                <w:sz w:val="17"/>
               </w:rPr>
-              <w:t>Dez/26</w:t>
+              <w:t>R$ 566.00</w:t>
+            </w:r>
+          </w:p>
+        </w:tc>
+      </w:tr>
+      <w:tr>
+        <w:tc>
+          <w:tcPr>
+            <w:tcW w:type="dxa" w:w="1419"/>
+          </w:tcPr>
+          <w:p>
+            <w:pPr>
+              <w:jc w:val="left"/>
+            </w:pPr>
+            <w:r>
+              <w:rPr>
+                <w:rFonts w:ascii="Calibri" w:hAnsi="Calibri"/>
+                <w:b w:val="0"/>
+                <w:i w:val="0"/>
+                <w:color w:val="18181B"/>
+                <w:sz w:val="17"/>
+              </w:rPr>
+              <w:t>Nov/26</w:t>
             </w:r>
           </w:p>
         </w:tc>
         <w:tc>
           <w:tcPr>
-            <w:tcW w:type="dxa" w:w="1656"/>
+            <w:tcW w:type="dxa" w:w="1419"/>
+          </w:tcPr>
+          <w:p>
+            <w:pPr>
+              <w:jc w:val="left"/>
+            </w:pPr>
+            <w:r>
+              <w:rPr>
+                <w:rFonts w:ascii="Calibri" w:hAnsi="Calibri"/>
+                <w:b w:val="0"/>
+                <w:i w:val="0"/>
+                <w:color w:val="18181B"/>
+                <w:sz w:val="17"/>
+              </w:rPr>
+              <w:t>1,000</w:t>
+            </w:r>
+          </w:p>
+        </w:tc>
+        <w:tc>
+          <w:tcPr>
+            <w:tcW w:type="dxa" w:w="1419"/>
+          </w:tcPr>
+          <w:p>
+            <w:pPr>
+              <w:jc w:val="left"/>
+            </w:pPr>
+            <w:r>
+              <w:rPr>
+                <w:rFonts w:ascii="Calibri" w:hAnsi="Calibri"/>
+                <w:b w:val="0"/>
+                <w:i w:val="0"/>
+                <w:color w:val="18181B"/>
+                <w:sz w:val="17"/>
+              </w:rPr>
+              <w:t>R$ 2,500.00</w:t>
+            </w:r>
+          </w:p>
+        </w:tc>
+        <w:tc>
+          <w:tcPr>
+            <w:tcW w:type="dxa" w:w="1419"/>
+          </w:tcPr>
+          <w:p>
+            <w:pPr>
+              <w:jc w:val="left"/>
+            </w:pPr>
+            <w:r>
+              <w:rPr>
+                <w:rFonts w:ascii="Calibri" w:hAnsi="Calibri"/>
+                <w:b w:val="0"/>
+                <w:i w:val="0"/>
+                <w:color w:val="18181B"/>
+                <w:sz w:val="17"/>
+              </w:rPr>
+              <w:t>R$ 2,600.00</w:t>
+            </w:r>
+          </w:p>
+        </w:tc>
+        <w:tc>
+          <w:tcPr>
+            <w:tcW w:type="dxa" w:w="1419"/>
+          </w:tcPr>
+          <w:p>
+            <w:pPr>
+              <w:jc w:val="left"/>
+            </w:pPr>
+            <w:r>
+              <w:rPr>
+                <w:rFonts w:ascii="Calibri" w:hAnsi="Calibri"/>
+                <w:b w:val="0"/>
+                <w:i w:val="0"/>
+                <w:color w:val="18181B"/>
+                <w:sz w:val="17"/>
+              </w:rPr>
+              <w:t>R$ 54,000.00</w:t>
+            </w:r>
+          </w:p>
+        </w:tc>
+        <w:tc>
+          <w:tcPr>
+            <w:tcW w:type="dxa" w:w="1419"/>
+          </w:tcPr>
+          <w:p>
+            <w:pPr>
+              <w:jc w:val="left"/>
+            </w:pPr>
+            <w:r>
+              <w:rPr>
+                <w:rFonts w:ascii="Calibri" w:hAnsi="Calibri"/>
+                <w:b w:val="0"/>
+                <w:i w:val="0"/>
+                <w:color w:val="18181B"/>
+                <w:sz w:val="17"/>
+              </w:rPr>
+              <w:t>R$ 56,600.00</w:t>
+            </w:r>
+          </w:p>
+        </w:tc>
+        <w:tc>
+          <w:tcPr>
+            <w:tcW w:type="dxa" w:w="1419"/>
+          </w:tcPr>
+          <w:p>
+            <w:pPr>
+              <w:jc w:val="left"/>
+            </w:pPr>
+            <w:r>
+              <w:rPr>
+                <w:rFonts w:ascii="Calibri" w:hAnsi="Calibri"/>
+                <w:b w:val="0"/>
+                <w:i w:val="0"/>
+                <w:color w:val="18181B"/>
+                <w:sz w:val="17"/>
+              </w:rPr>
+              <w:t>R$ 56.60</w:t>
+            </w:r>
+          </w:p>
+        </w:tc>
+      </w:tr>
+      <w:tr>
+        <w:tc>
+          <w:tcPr>
+            <w:tcW w:type="dxa" w:w="1419"/>
             <w:shd w:fill="F4F4F5"/>
           </w:tcPr>
           <w:p>
@@ -479,15 +521,15 @@
                 <w:b w:val="0"/>
                 <w:i w:val="0"/>
                 <w:color w:val="18181B"/>
-                <w:sz w:val="18"/>
+                <w:sz w:val="17"/>
               </w:rPr>
-              <w:t>10,000</w:t>
+              <w:t>Dez/26</w:t>
             </w:r>
           </w:p>
         </w:tc>
         <w:tc>
           <w:tcPr>
-            <w:tcW w:type="dxa" w:w="1656"/>
+            <w:tcW w:type="dxa" w:w="1419"/>
             <w:shd w:fill="F4F4F5"/>
           </w:tcPr>
           <w:p>
@@ -500,15 +542,15 @@
                 <w:b w:val="0"/>
                 <w:i w:val="0"/>
                 <w:color w:val="18181B"/>
-                <w:sz w:val="18"/>
+                <w:sz w:val="17"/>
               </w:rPr>
-              <w:t>R$ 750.00</w:t>
+              <w:t>10,000</w:t>
             </w:r>
           </w:p>
         </w:tc>
         <w:tc>
           <w:tcPr>
-            <w:tcW w:type="dxa" w:w="1656"/>
+            <w:tcW w:type="dxa" w:w="1419"/>
             <w:shd w:fill="F4F4F5"/>
           </w:tcPr>
           <w:p>
@@ -521,15 +563,15 @@
                 <w:b w:val="0"/>
                 <w:i w:val="0"/>
                 <w:color w:val="18181B"/>
-                <w:sz w:val="18"/>
+                <w:sz w:val="17"/>
               </w:rPr>
-              <w:t>R$ 54,000.00</w:t>
+              <w:t>R$ 2,500.00</w:t>
             </w:r>
           </w:p>
         </w:tc>
         <w:tc>
           <w:tcPr>
-            <w:tcW w:type="dxa" w:w="1656"/>
+            <w:tcW w:type="dxa" w:w="1419"/>
             <w:shd w:fill="F4F4F5"/>
           </w:tcPr>
           <w:p>
@@ -542,15 +584,15 @@
                 <w:b w:val="0"/>
                 <w:i w:val="0"/>
                 <w:color w:val="18181B"/>
-                <w:sz w:val="18"/>
+                <w:sz w:val="17"/>
               </w:rPr>
-              <w:t>R$ 54,750.00</w:t>
+              <w:t>R$ 2,800.00</w:t>
             </w:r>
           </w:p>
         </w:tc>
         <w:tc>
           <w:tcPr>
-            <w:tcW w:type="dxa" w:w="1656"/>
+            <w:tcW w:type="dxa" w:w="1419"/>
             <w:shd w:fill="F4F4F5"/>
           </w:tcPr>
           <w:p>
@@ -563,139 +605,15 @@
                 <w:b w:val="0"/>
                 <w:i w:val="0"/>
                 <w:color w:val="18181B"/>
-                <w:sz w:val="18"/>
+                <w:sz w:val="17"/>
               </w:rPr>
-              <w:t>R$ 5.47</w:t>
-            </w:r>
-          </w:p>
-        </w:tc>
-      </w:tr>
-      <w:tr>
-        <w:tc>
-          <w:tcPr>
-            <w:tcW w:type="dxa" w:w="1656"/>
-          </w:tcPr>
-          <w:p>
-            <w:pPr>
-              <w:jc w:val="left"/>
-            </w:pPr>
-            <w:r>
-              <w:rPr>
-                <w:rFonts w:ascii="Calibri" w:hAnsi="Calibri"/>
-                <w:b w:val="0"/>
-                <w:i w:val="0"/>
-                <w:color w:val="18181B"/>
-                <w:sz w:val="18"/>
-              </w:rPr>
-              <w:t>Jan/27</w:t>
+              <w:t>R$ 54,000.00</w:t>
             </w:r>
           </w:p>
         </w:tc>
         <w:tc>
           <w:tcPr>
-            <w:tcW w:type="dxa" w:w="1656"/>
-          </w:tcPr>
-          <w:p>
-            <w:pPr>
-              <w:jc w:val="left"/>
-            </w:pPr>
-            <w:r>
-              <w:rPr>
-                <w:rFonts w:ascii="Calibri" w:hAnsi="Calibri"/>
-                <w:b w:val="0"/>
-                <w:i w:val="0"/>
-                <w:color w:val="18181B"/>
-                <w:sz w:val="18"/>
-              </w:rPr>
-              <w:t>50,000</w:t>
-            </w:r>
-          </w:p>
-        </w:tc>
-        <w:tc>
-          <w:tcPr>
-            <w:tcW w:type="dxa" w:w="1656"/>
-          </w:tcPr>
-          <w:p>
-            <w:pPr>
-              <w:jc w:val="left"/>
-            </w:pPr>
-            <w:r>
-              <w:rPr>
-                <w:rFonts w:ascii="Calibri" w:hAnsi="Calibri"/>
-                <w:b w:val="0"/>
-                <w:i w:val="0"/>
-                <w:color w:val="18181B"/>
-                <w:sz w:val="18"/>
-              </w:rPr>
-              <w:t>R$ 2,613.00</w:t>
-            </w:r>
-          </w:p>
-        </w:tc>
-        <w:tc>
-          <w:tcPr>
-            <w:tcW w:type="dxa" w:w="1656"/>
-          </w:tcPr>
-          <w:p>
-            <w:pPr>
-              <w:jc w:val="left"/>
-            </w:pPr>
-            <w:r>
-              <w:rPr>
-                <w:rFonts w:ascii="Calibri" w:hAnsi="Calibri"/>
-                <w:b w:val="0"/>
-                <w:i w:val="0"/>
-                <w:color w:val="18181B"/>
-                <w:sz w:val="18"/>
-              </w:rPr>
-              <w:t>R$ 80,500.00</w:t>
-            </w:r>
-          </w:p>
-        </w:tc>
-        <w:tc>
-          <w:tcPr>
-            <w:tcW w:type="dxa" w:w="1656"/>
-          </w:tcPr>
-          <w:p>
-            <w:pPr>
-              <w:jc w:val="left"/>
-            </w:pPr>
-            <w:r>
-              <w:rPr>
-                <w:rFonts w:ascii="Calibri" w:hAnsi="Calibri"/>
-                <w:b w:val="0"/>
-                <w:i w:val="0"/>
-                <w:color w:val="18181B"/>
-                <w:sz w:val="18"/>
-              </w:rPr>
-              <w:t>R$ 83,113.00</w:t>
-            </w:r>
-          </w:p>
-        </w:tc>
-        <w:tc>
-          <w:tcPr>
-            <w:tcW w:type="dxa" w:w="1656"/>
-          </w:tcPr>
-          <w:p>
-            <w:pPr>
-              <w:jc w:val="left"/>
-            </w:pPr>
-            <w:r>
-              <w:rPr>
-                <w:rFonts w:ascii="Calibri" w:hAnsi="Calibri"/>
-                <w:b w:val="0"/>
-                <w:i w:val="0"/>
-                <w:color w:val="18181B"/>
-                <w:sz w:val="18"/>
-              </w:rPr>
-              <w:t>R$ 1.66</w:t>
-            </w:r>
-          </w:p>
-        </w:tc>
-      </w:tr>
-      <w:tr>
-        <w:tc>
-          <w:tcPr>
-            <w:tcW w:type="dxa" w:w="1656"/>
+            <w:tcW w:type="dxa" w:w="1419"/>
             <w:shd w:fill="F4F4F5"/>
           </w:tcPr>
           <w:p>
@@ -708,15 +626,15 @@
                 <w:b w:val="0"/>
                 <w:i w:val="0"/>
                 <w:color w:val="18181B"/>
-                <w:sz w:val="18"/>
+                <w:sz w:val="17"/>
               </w:rPr>
-              <w:t>Fev/27</w:t>
+              <w:t>R$ 56,800.00</w:t>
             </w:r>
           </w:p>
         </w:tc>
         <w:tc>
           <w:tcPr>
-            <w:tcW w:type="dxa" w:w="1656"/>
+            <w:tcW w:type="dxa" w:w="1419"/>
             <w:shd w:fill="F4F4F5"/>
           </w:tcPr>
           <w:p>
@@ -729,15 +647,159 @@
                 <w:b w:val="0"/>
                 <w:i w:val="0"/>
                 <w:color w:val="18181B"/>
-                <w:sz w:val="18"/>
+                <w:sz w:val="17"/>
               </w:rPr>
-              <w:t>100,000</w:t>
+              <w:t>R$ 5.68</w:t>
+            </w:r>
+          </w:p>
+        </w:tc>
+      </w:tr>
+      <w:tr>
+        <w:tc>
+          <w:tcPr>
+            <w:tcW w:type="dxa" w:w="1419"/>
+          </w:tcPr>
+          <w:p>
+            <w:pPr>
+              <w:jc w:val="left"/>
+            </w:pPr>
+            <w:r>
+              <w:rPr>
+                <w:rFonts w:ascii="Calibri" w:hAnsi="Calibri"/>
+                <w:b w:val="0"/>
+                <w:i w:val="0"/>
+                <w:color w:val="18181B"/>
+                <w:sz w:val="17"/>
+              </w:rPr>
+              <w:t>Jan/27</w:t>
             </w:r>
           </w:p>
         </w:tc>
         <w:tc>
           <w:tcPr>
-            <w:tcW w:type="dxa" w:w="1656"/>
+            <w:tcW w:type="dxa" w:w="1419"/>
+          </w:tcPr>
+          <w:p>
+            <w:pPr>
+              <w:jc w:val="left"/>
+            </w:pPr>
+            <w:r>
+              <w:rPr>
+                <w:rFonts w:ascii="Calibri" w:hAnsi="Calibri"/>
+                <w:b w:val="0"/>
+                <w:i w:val="0"/>
+                <w:color w:val="18181B"/>
+                <w:sz w:val="17"/>
+              </w:rPr>
+              <w:t>50,000</w:t>
+            </w:r>
+          </w:p>
+        </w:tc>
+        <w:tc>
+          <w:tcPr>
+            <w:tcW w:type="dxa" w:w="1419"/>
+          </w:tcPr>
+          <w:p>
+            <w:pPr>
+              <w:jc w:val="left"/>
+            </w:pPr>
+            <w:r>
+              <w:rPr>
+                <w:rFonts w:ascii="Calibri" w:hAnsi="Calibri"/>
+                <w:b w:val="0"/>
+                <w:i w:val="0"/>
+                <w:color w:val="18181B"/>
+                <w:sz w:val="17"/>
+              </w:rPr>
+              <w:t>R$ 2,500.00</w:t>
+            </w:r>
+          </w:p>
+        </w:tc>
+        <w:tc>
+          <w:tcPr>
+            <w:tcW w:type="dxa" w:w="1419"/>
+          </w:tcPr>
+          <w:p>
+            <w:pPr>
+              <w:jc w:val="left"/>
+            </w:pPr>
+            <w:r>
+              <w:rPr>
+                <w:rFonts w:ascii="Calibri" w:hAnsi="Calibri"/>
+                <w:b w:val="0"/>
+                <w:i w:val="0"/>
+                <w:color w:val="18181B"/>
+                <w:sz w:val="17"/>
+              </w:rPr>
+              <w:t>R$ 4,000.00</w:t>
+            </w:r>
+          </w:p>
+        </w:tc>
+        <w:tc>
+          <w:tcPr>
+            <w:tcW w:type="dxa" w:w="1419"/>
+          </w:tcPr>
+          <w:p>
+            <w:pPr>
+              <w:jc w:val="left"/>
+            </w:pPr>
+            <w:r>
+              <w:rPr>
+                <w:rFonts w:ascii="Calibri" w:hAnsi="Calibri"/>
+                <w:b w:val="0"/>
+                <w:i w:val="0"/>
+                <w:color w:val="18181B"/>
+                <w:sz w:val="17"/>
+              </w:rPr>
+              <w:t>R$ 80,500.00</w:t>
+            </w:r>
+          </w:p>
+        </w:tc>
+        <w:tc>
+          <w:tcPr>
+            <w:tcW w:type="dxa" w:w="1419"/>
+          </w:tcPr>
+          <w:p>
+            <w:pPr>
+              <w:jc w:val="left"/>
+            </w:pPr>
+            <w:r>
+              <w:rPr>
+                <w:rFonts w:ascii="Calibri" w:hAnsi="Calibri"/>
+                <w:b w:val="0"/>
+                <w:i w:val="0"/>
+                <w:color w:val="18181B"/>
+                <w:sz w:val="17"/>
+              </w:rPr>
+              <w:t>R$ 84,500.00</w:t>
+            </w:r>
+          </w:p>
+        </w:tc>
+        <w:tc>
+          <w:tcPr>
+            <w:tcW w:type="dxa" w:w="1419"/>
+          </w:tcPr>
+          <w:p>
+            <w:pPr>
+              <w:jc w:val="left"/>
+            </w:pPr>
+            <w:r>
+              <w:rPr>
+                <w:rFonts w:ascii="Calibri" w:hAnsi="Calibri"/>
+                <w:b w:val="0"/>
+                <w:i w:val="0"/>
+                <w:color w:val="18181B"/>
+                <w:sz w:val="17"/>
+              </w:rPr>
+              <w:t>R$ 1.69</w:t>
+            </w:r>
+          </w:p>
+        </w:tc>
+      </w:tr>
+      <w:tr>
+        <w:tc>
+          <w:tcPr>
+            <w:tcW w:type="dxa" w:w="1419"/>
             <w:shd w:fill="F4F4F5"/>
           </w:tcPr>
           <w:p>
@@ -750,15 +812,15 @@
                 <w:b w:val="0"/>
                 <w:i w:val="0"/>
                 <w:color w:val="18181B"/>
-                <w:sz w:val="18"/>
+                <w:sz w:val="17"/>
               </w:rPr>
-              <w:t>R$ 5,226.00</w:t>
+              <w:t>Fev/27</w:t>
             </w:r>
           </w:p>
         </w:tc>
         <w:tc>
           <w:tcPr>
-            <w:tcW w:type="dxa" w:w="1656"/>
+            <w:tcW w:type="dxa" w:w="1419"/>
             <w:shd w:fill="F4F4F5"/>
           </w:tcPr>
           <w:p>
@@ -771,15 +833,15 @@
                 <w:b w:val="0"/>
                 <w:i w:val="0"/>
                 <w:color w:val="18181B"/>
-                <w:sz w:val="18"/>
+                <w:sz w:val="17"/>
               </w:rPr>
-              <w:t>R$ 80,500.00</w:t>
+              <w:t>100,000</w:t>
             </w:r>
           </w:p>
         </w:tc>
         <w:tc>
           <w:tcPr>
-            <w:tcW w:type="dxa" w:w="1656"/>
+            <w:tcW w:type="dxa" w:w="1419"/>
             <w:shd w:fill="F4F4F5"/>
           </w:tcPr>
           <w:p>
@@ -792,15 +854,15 @@
                 <w:b w:val="0"/>
                 <w:i w:val="0"/>
                 <w:color w:val="18181B"/>
-                <w:sz w:val="18"/>
+                <w:sz w:val="17"/>
               </w:rPr>
-              <w:t>R$ 85,726.00</w:t>
+              <w:t>R$ 4,800.00</w:t>
             </w:r>
           </w:p>
         </w:tc>
         <w:tc>
           <w:tcPr>
-            <w:tcW w:type="dxa" w:w="1656"/>
+            <w:tcW w:type="dxa" w:w="1419"/>
             <w:shd w:fill="F4F4F5"/>
           </w:tcPr>
           <w:p>
@@ -813,139 +875,15 @@
                 <w:b w:val="0"/>
                 <w:i w:val="0"/>
                 <w:color w:val="18181B"/>
-                <w:sz w:val="18"/>
+                <w:sz w:val="17"/>
               </w:rPr>
-              <w:t>R$ 0.86</w:t>
-            </w:r>
-          </w:p>
-        </w:tc>
-      </w:tr>
-      <w:tr>
-        <w:tc>
-          <w:tcPr>
-            <w:tcW w:type="dxa" w:w="1656"/>
-          </w:tcPr>
-          <w:p>
-            <w:pPr>
-              <w:jc w:val="left"/>
-            </w:pPr>
-            <w:r>
-              <w:rPr>
-                <w:rFonts w:ascii="Calibri" w:hAnsi="Calibri"/>
-                <w:b w:val="0"/>
-                <w:i w:val="0"/>
-                <w:color w:val="18181B"/>
-                <w:sz w:val="18"/>
-              </w:rPr>
-              <w:t>Mar/27</w:t>
+              <w:t>R$ 7,800.00</w:t>
             </w:r>
           </w:p>
         </w:tc>
         <w:tc>
           <w:tcPr>
-            <w:tcW w:type="dxa" w:w="1656"/>
-          </w:tcPr>
-          <w:p>
-            <w:pPr>
-              <w:jc w:val="left"/>
-            </w:pPr>
-            <w:r>
-              <w:rPr>
-                <w:rFonts w:ascii="Calibri" w:hAnsi="Calibri"/>
-                <w:b w:val="0"/>
-                <w:i w:val="0"/>
-                <w:color w:val="18181B"/>
-                <w:sz w:val="18"/>
-              </w:rPr>
-              <w:t>150,000</w:t>
-            </w:r>
-          </w:p>
-        </w:tc>
-        <w:tc>
-          <w:tcPr>
-            <w:tcW w:type="dxa" w:w="1656"/>
-          </w:tcPr>
-          <w:p>
-            <w:pPr>
-              <w:jc w:val="left"/>
-            </w:pPr>
-            <w:r>
-              <w:rPr>
-                <w:rFonts w:ascii="Calibri" w:hAnsi="Calibri"/>
-                <w:b w:val="0"/>
-                <w:i w:val="0"/>
-                <w:color w:val="18181B"/>
-                <w:sz w:val="18"/>
-              </w:rPr>
-              <w:t>R$ 7,839.00</w:t>
-            </w:r>
-          </w:p>
-        </w:tc>
-        <w:tc>
-          <w:tcPr>
-            <w:tcW w:type="dxa" w:w="1656"/>
-          </w:tcPr>
-          <w:p>
-            <w:pPr>
-              <w:jc w:val="left"/>
-            </w:pPr>
-            <w:r>
-              <w:rPr>
-                <w:rFonts w:ascii="Calibri" w:hAnsi="Calibri"/>
-                <w:b w:val="0"/>
-                <w:i w:val="0"/>
-                <w:color w:val="18181B"/>
-                <w:sz w:val="18"/>
-              </w:rPr>
-              <w:t>R$ 80,500.00</w:t>
-            </w:r>
-          </w:p>
-        </w:tc>
-        <w:tc>
-          <w:tcPr>
-            <w:tcW w:type="dxa" w:w="1656"/>
-          </w:tcPr>
-          <w:p>
-            <w:pPr>
-              <w:jc w:val="left"/>
-            </w:pPr>
-            <w:r>
-              <w:rPr>
-                <w:rFonts w:ascii="Calibri" w:hAnsi="Calibri"/>
-                <w:b w:val="0"/>
-                <w:i w:val="0"/>
-                <w:color w:val="18181B"/>
-                <w:sz w:val="18"/>
-              </w:rPr>
-              <w:t>R$ 88,339.00</w:t>
-            </w:r>
-          </w:p>
-        </w:tc>
-        <w:tc>
-          <w:tcPr>
-            <w:tcW w:type="dxa" w:w="1656"/>
-          </w:tcPr>
-          <w:p>
-            <w:pPr>
-              <w:jc w:val="left"/>
-            </w:pPr>
-            <w:r>
-              <w:rPr>
-                <w:rFonts w:ascii="Calibri" w:hAnsi="Calibri"/>
-                <w:b w:val="0"/>
-                <w:i w:val="0"/>
-                <w:color w:val="18181B"/>
-                <w:sz w:val="18"/>
-              </w:rPr>
-              <w:t>R$ 0.59</w:t>
-            </w:r>
-          </w:p>
-        </w:tc>
-      </w:tr>
-      <w:tr>
-        <w:tc>
-          <w:tcPr>
-            <w:tcW w:type="dxa" w:w="1656"/>
+            <w:tcW w:type="dxa" w:w="1419"/>
             <w:shd w:fill="F4F4F5"/>
           </w:tcPr>
           <w:p>
@@ -958,15 +896,15 @@
                 <w:b w:val="0"/>
                 <w:i w:val="0"/>
                 <w:color w:val="18181B"/>
-                <w:sz w:val="18"/>
+                <w:sz w:val="17"/>
               </w:rPr>
-              <w:t>Abr/27</w:t>
+              <w:t>R$ 80,500.00</w:t>
             </w:r>
           </w:p>
         </w:tc>
         <w:tc>
           <w:tcPr>
-            <w:tcW w:type="dxa" w:w="1656"/>
+            <w:tcW w:type="dxa" w:w="1419"/>
             <w:shd w:fill="F4F4F5"/>
           </w:tcPr>
           <w:p>
@@ -979,15 +917,15 @@
                 <w:b w:val="0"/>
                 <w:i w:val="0"/>
                 <w:color w:val="18181B"/>
-                <w:sz w:val="18"/>
+                <w:sz w:val="17"/>
               </w:rPr>
-              <w:t>200,000</w:t>
+              <w:t>R$ 88,300.00</w:t>
             </w:r>
           </w:p>
         </w:tc>
         <w:tc>
           <w:tcPr>
-            <w:tcW w:type="dxa" w:w="1656"/>
+            <w:tcW w:type="dxa" w:w="1419"/>
             <w:shd w:fill="F4F4F5"/>
           </w:tcPr>
           <w:p>
@@ -1000,15 +938,159 @@
                 <w:b w:val="0"/>
                 <w:i w:val="0"/>
                 <w:color w:val="18181B"/>
-                <w:sz w:val="18"/>
+                <w:sz w:val="17"/>
               </w:rPr>
-              <w:t>R$ 10,452.00</w:t>
+              <w:t>R$ 0.88</w:t>
+            </w:r>
+          </w:p>
+        </w:tc>
+      </w:tr>
+      <w:tr>
+        <w:tc>
+          <w:tcPr>
+            <w:tcW w:type="dxa" w:w="1419"/>
+          </w:tcPr>
+          <w:p>
+            <w:pPr>
+              <w:jc w:val="left"/>
+            </w:pPr>
+            <w:r>
+              <w:rPr>
+                <w:rFonts w:ascii="Calibri" w:hAnsi="Calibri"/>
+                <w:b w:val="0"/>
+                <w:i w:val="0"/>
+                <w:color w:val="18181B"/>
+                <w:sz w:val="17"/>
+              </w:rPr>
+              <w:t>Mar/27</w:t>
             </w:r>
           </w:p>
         </w:tc>
         <w:tc>
           <w:tcPr>
-            <w:tcW w:type="dxa" w:w="1656"/>
+            <w:tcW w:type="dxa" w:w="1419"/>
+          </w:tcPr>
+          <w:p>
+            <w:pPr>
+              <w:jc w:val="left"/>
+            </w:pPr>
+            <w:r>
+              <w:rPr>
+                <w:rFonts w:ascii="Calibri" w:hAnsi="Calibri"/>
+                <w:b w:val="0"/>
+                <w:i w:val="0"/>
+                <w:color w:val="18181B"/>
+                <w:sz w:val="17"/>
+              </w:rPr>
+              <w:t>150,000</w:t>
+            </w:r>
+          </w:p>
+        </w:tc>
+        <w:tc>
+          <w:tcPr>
+            <w:tcW w:type="dxa" w:w="1419"/>
+          </w:tcPr>
+          <w:p>
+            <w:pPr>
+              <w:jc w:val="left"/>
+            </w:pPr>
+            <w:r>
+              <w:rPr>
+                <w:rFonts w:ascii="Calibri" w:hAnsi="Calibri"/>
+                <w:b w:val="0"/>
+                <w:i w:val="0"/>
+                <w:color w:val="18181B"/>
+                <w:sz w:val="17"/>
+              </w:rPr>
+              <w:t>R$ 7,200.00</w:t>
+            </w:r>
+          </w:p>
+        </w:tc>
+        <w:tc>
+          <w:tcPr>
+            <w:tcW w:type="dxa" w:w="1419"/>
+          </w:tcPr>
+          <w:p>
+            <w:pPr>
+              <w:jc w:val="left"/>
+            </w:pPr>
+            <w:r>
+              <w:rPr>
+                <w:rFonts w:ascii="Calibri" w:hAnsi="Calibri"/>
+                <w:b w:val="0"/>
+                <w:i w:val="0"/>
+                <w:color w:val="18181B"/>
+                <w:sz w:val="17"/>
+              </w:rPr>
+              <w:t>R$ 11,700.00</w:t>
+            </w:r>
+          </w:p>
+        </w:tc>
+        <w:tc>
+          <w:tcPr>
+            <w:tcW w:type="dxa" w:w="1419"/>
+          </w:tcPr>
+          <w:p>
+            <w:pPr>
+              <w:jc w:val="left"/>
+            </w:pPr>
+            <w:r>
+              <w:rPr>
+                <w:rFonts w:ascii="Calibri" w:hAnsi="Calibri"/>
+                <w:b w:val="0"/>
+                <w:i w:val="0"/>
+                <w:color w:val="18181B"/>
+                <w:sz w:val="17"/>
+              </w:rPr>
+              <w:t>R$ 80,500.00</w:t>
+            </w:r>
+          </w:p>
+        </w:tc>
+        <w:tc>
+          <w:tcPr>
+            <w:tcW w:type="dxa" w:w="1419"/>
+          </w:tcPr>
+          <w:p>
+            <w:pPr>
+              <w:jc w:val="left"/>
+            </w:pPr>
+            <w:r>
+              <w:rPr>
+                <w:rFonts w:ascii="Calibri" w:hAnsi="Calibri"/>
+                <w:b w:val="0"/>
+                <w:i w:val="0"/>
+                <w:color w:val="18181B"/>
+                <w:sz w:val="17"/>
+              </w:rPr>
+              <w:t>R$ 92,200.00</w:t>
+            </w:r>
+          </w:p>
+        </w:tc>
+        <w:tc>
+          <w:tcPr>
+            <w:tcW w:type="dxa" w:w="1419"/>
+          </w:tcPr>
+          <w:p>
+            <w:pPr>
+              <w:jc w:val="left"/>
+            </w:pPr>
+            <w:r>
+              <w:rPr>
+                <w:rFonts w:ascii="Calibri" w:hAnsi="Calibri"/>
+                <w:b w:val="0"/>
+                <w:i w:val="0"/>
+                <w:color w:val="18181B"/>
+                <w:sz w:val="17"/>
+              </w:rPr>
+              <w:t>R$ 0.61</w:t>
+            </w:r>
+          </w:p>
+        </w:tc>
+      </w:tr>
+      <w:tr>
+        <w:tc>
+          <w:tcPr>
+            <w:tcW w:type="dxa" w:w="1419"/>
             <w:shd w:fill="F4F4F5"/>
           </w:tcPr>
           <w:p>
@@ -1021,15 +1103,15 @@
                 <w:b w:val="0"/>
                 <w:i w:val="0"/>
                 <w:color w:val="18181B"/>
-                <w:sz w:val="18"/>
+                <w:sz w:val="17"/>
               </w:rPr>
-              <w:t>R$ 80,500.00</w:t>
+              <w:t>Abr/27</w:t>
             </w:r>
           </w:p>
         </w:tc>
         <w:tc>
           <w:tcPr>
-            <w:tcW w:type="dxa" w:w="1656"/>
+            <w:tcW w:type="dxa" w:w="1419"/>
             <w:shd w:fill="F4F4F5"/>
           </w:tcPr>
           <w:p>
@@ -1042,15 +1124,15 @@
                 <w:b w:val="0"/>
                 <w:i w:val="0"/>
                 <w:color w:val="18181B"/>
-                <w:sz w:val="18"/>
+                <w:sz w:val="17"/>
               </w:rPr>
-              <w:t>R$ 90,952.00</w:t>
+              <w:t>200,000</w:t>
             </w:r>
           </w:p>
         </w:tc>
         <w:tc>
           <w:tcPr>
-            <w:tcW w:type="dxa" w:w="1656"/>
+            <w:tcW w:type="dxa" w:w="1419"/>
             <w:shd w:fill="F4F4F5"/>
           </w:tcPr>
           <w:p>
@@ -1063,139 +1145,15 @@
                 <w:b w:val="0"/>
                 <w:i w:val="0"/>
                 <w:color w:val="18181B"/>
-                <w:sz w:val="18"/>
+                <w:sz w:val="17"/>
               </w:rPr>
-              <w:t>R$ 0.45</w:t>
-            </w:r>
-          </w:p>
-        </w:tc>
-      </w:tr>
-      <w:tr>
-        <w:tc>
-          <w:tcPr>
-            <w:tcW w:type="dxa" w:w="1656"/>
-          </w:tcPr>
-          <w:p>
-            <w:pPr>
-              <w:jc w:val="left"/>
-            </w:pPr>
-            <w:r>
-              <w:rPr>
-                <w:rFonts w:ascii="Calibri" w:hAnsi="Calibri"/>
-                <w:b w:val="0"/>
-                <w:i w:val="0"/>
-                <w:color w:val="18181B"/>
-                <w:sz w:val="18"/>
-              </w:rPr>
-              <w:t>Mai/27</w:t>
+              <w:t>R$ 9,600.00</w:t>
             </w:r>
           </w:p>
         </w:tc>
         <w:tc>
           <w:tcPr>
-            <w:tcW w:type="dxa" w:w="1656"/>
-          </w:tcPr>
-          <w:p>
-            <w:pPr>
-              <w:jc w:val="left"/>
-            </w:pPr>
-            <w:r>
-              <w:rPr>
-                <w:rFonts w:ascii="Calibri" w:hAnsi="Calibri"/>
-                <w:b w:val="0"/>
-                <w:i w:val="0"/>
-                <w:color w:val="18181B"/>
-                <w:sz w:val="18"/>
-              </w:rPr>
-              <w:t>225,000</w:t>
-            </w:r>
-          </w:p>
-        </w:tc>
-        <w:tc>
-          <w:tcPr>
-            <w:tcW w:type="dxa" w:w="1656"/>
-          </w:tcPr>
-          <w:p>
-            <w:pPr>
-              <w:jc w:val="left"/>
-            </w:pPr>
-            <w:r>
-              <w:rPr>
-                <w:rFonts w:ascii="Calibri" w:hAnsi="Calibri"/>
-                <w:b w:val="0"/>
-                <w:i w:val="0"/>
-                <w:color w:val="18181B"/>
-                <w:sz w:val="18"/>
-              </w:rPr>
-              <w:t>R$ 11,758.50</w:t>
-            </w:r>
-          </w:p>
-        </w:tc>
-        <w:tc>
-          <w:tcPr>
-            <w:tcW w:type="dxa" w:w="1656"/>
-          </w:tcPr>
-          <w:p>
-            <w:pPr>
-              <w:jc w:val="left"/>
-            </w:pPr>
-            <w:r>
-              <w:rPr>
-                <w:rFonts w:ascii="Calibri" w:hAnsi="Calibri"/>
-                <w:b w:val="0"/>
-                <w:i w:val="0"/>
-                <w:color w:val="18181B"/>
-                <w:sz w:val="18"/>
-              </w:rPr>
-              <w:t>R$ 80,500.00</w:t>
-            </w:r>
-          </w:p>
-        </w:tc>
-        <w:tc>
-          <w:tcPr>
-            <w:tcW w:type="dxa" w:w="1656"/>
-          </w:tcPr>
-          <w:p>
-            <w:pPr>
-              <w:jc w:val="left"/>
-            </w:pPr>
-            <w:r>
-              <w:rPr>
-                <w:rFonts w:ascii="Calibri" w:hAnsi="Calibri"/>
-                <w:b w:val="0"/>
-                <w:i w:val="0"/>
-                <w:color w:val="18181B"/>
-                <w:sz w:val="18"/>
-              </w:rPr>
-              <w:t>R$ 92,258.50</w:t>
-            </w:r>
-          </w:p>
-        </w:tc>
-        <w:tc>
-          <w:tcPr>
-            <w:tcW w:type="dxa" w:w="1656"/>
-          </w:tcPr>
-          <w:p>
-            <w:pPr>
-              <w:jc w:val="left"/>
-            </w:pPr>
-            <w:r>
-              <w:rPr>
-                <w:rFonts w:ascii="Calibri" w:hAnsi="Calibri"/>
-                <w:b w:val="0"/>
-                <w:i w:val="0"/>
-                <w:color w:val="18181B"/>
-                <w:sz w:val="18"/>
-              </w:rPr>
-              <w:t>R$ 0.41</w:t>
-            </w:r>
-          </w:p>
-        </w:tc>
-      </w:tr>
-      <w:tr>
-        <w:tc>
-          <w:tcPr>
-            <w:tcW w:type="dxa" w:w="1656"/>
+            <w:tcW w:type="dxa" w:w="1419"/>
             <w:shd w:fill="F4F4F5"/>
           </w:tcPr>
           <w:p>
@@ -1208,15 +1166,15 @@
                 <w:b w:val="0"/>
                 <w:i w:val="0"/>
                 <w:color w:val="18181B"/>
-                <w:sz w:val="18"/>
+                <w:sz w:val="17"/>
               </w:rPr>
-              <w:t>Jun/27</w:t>
+              <w:t>R$ 15,600.00</w:t>
             </w:r>
           </w:p>
         </w:tc>
         <w:tc>
           <w:tcPr>
-            <w:tcW w:type="dxa" w:w="1656"/>
+            <w:tcW w:type="dxa" w:w="1419"/>
             <w:shd w:fill="F4F4F5"/>
           </w:tcPr>
           <w:p>
@@ -1229,15 +1187,15 @@
                 <w:b w:val="0"/>
                 <w:i w:val="0"/>
                 <w:color w:val="18181B"/>
-                <w:sz w:val="18"/>
+                <w:sz w:val="17"/>
               </w:rPr>
-              <w:t>250,000</w:t>
+              <w:t>R$ 80,500.00</w:t>
             </w:r>
           </w:p>
         </w:tc>
         <w:tc>
           <w:tcPr>
-            <w:tcW w:type="dxa" w:w="1656"/>
+            <w:tcW w:type="dxa" w:w="1419"/>
             <w:shd w:fill="F4F4F5"/>
           </w:tcPr>
           <w:p>
@@ -1250,15 +1208,15 @@
                 <w:b w:val="0"/>
                 <w:i w:val="0"/>
                 <w:color w:val="18181B"/>
-                <w:sz w:val="18"/>
+                <w:sz w:val="17"/>
               </w:rPr>
-              <w:t>R$ 13,065.00</w:t>
+              <w:t>R$ 96,100.00</w:t>
             </w:r>
           </w:p>
         </w:tc>
         <w:tc>
           <w:tcPr>
-            <w:tcW w:type="dxa" w:w="1656"/>
+            <w:tcW w:type="dxa" w:w="1419"/>
             <w:shd w:fill="F4F4F5"/>
           </w:tcPr>
           <w:p>
@@ -1271,7 +1229,109 @@
                 <w:b w:val="0"/>
                 <w:i w:val="0"/>
                 <w:color w:val="18181B"/>
-                <w:sz w:val="18"/>
+                <w:sz w:val="17"/>
+              </w:rPr>
+              <w:t>R$ 0.48</w:t>
+            </w:r>
+          </w:p>
+        </w:tc>
+      </w:tr>
+      <w:tr>
+        <w:tc>
+          <w:tcPr>
+            <w:tcW w:type="dxa" w:w="1419"/>
+          </w:tcPr>
+          <w:p>
+            <w:pPr>
+              <w:jc w:val="left"/>
+            </w:pPr>
+            <w:r>
+              <w:rPr>
+                <w:rFonts w:ascii="Calibri" w:hAnsi="Calibri"/>
+                <w:b w:val="0"/>
+                <w:i w:val="0"/>
+                <w:color w:val="18181B"/>
+                <w:sz w:val="17"/>
+              </w:rPr>
+              <w:t>Mai/27</w:t>
+            </w:r>
+          </w:p>
+        </w:tc>
+        <w:tc>
+          <w:tcPr>
+            <w:tcW w:type="dxa" w:w="1419"/>
+          </w:tcPr>
+          <w:p>
+            <w:pPr>
+              <w:jc w:val="left"/>
+            </w:pPr>
+            <w:r>
+              <w:rPr>
+                <w:rFonts w:ascii="Calibri" w:hAnsi="Calibri"/>
+                <w:b w:val="0"/>
+                <w:i w:val="0"/>
+                <w:color w:val="18181B"/>
+                <w:sz w:val="17"/>
+              </w:rPr>
+              <w:t>225,000</w:t>
+            </w:r>
+          </w:p>
+        </w:tc>
+        <w:tc>
+          <w:tcPr>
+            <w:tcW w:type="dxa" w:w="1419"/>
+          </w:tcPr>
+          <w:p>
+            <w:pPr>
+              <w:jc w:val="left"/>
+            </w:pPr>
+            <w:r>
+              <w:rPr>
+                <w:rFonts w:ascii="Calibri" w:hAnsi="Calibri"/>
+                <w:b w:val="0"/>
+                <w:i w:val="0"/>
+                <w:color w:val="18181B"/>
+                <w:sz w:val="17"/>
+              </w:rPr>
+              <w:t>R$ 10,800.00</w:t>
+            </w:r>
+          </w:p>
+        </w:tc>
+        <w:tc>
+          <w:tcPr>
+            <w:tcW w:type="dxa" w:w="1419"/>
+          </w:tcPr>
+          <w:p>
+            <w:pPr>
+              <w:jc w:val="left"/>
+            </w:pPr>
+            <w:r>
+              <w:rPr>
+                <w:rFonts w:ascii="Calibri" w:hAnsi="Calibri"/>
+                <w:b w:val="0"/>
+                <w:i w:val="0"/>
+                <w:color w:val="18181B"/>
+                <w:sz w:val="17"/>
+              </w:rPr>
+              <w:t>R$ 17,550.00</w:t>
+            </w:r>
+          </w:p>
+        </w:tc>
+        <w:tc>
+          <w:tcPr>
+            <w:tcW w:type="dxa" w:w="1419"/>
+          </w:tcPr>
+          <w:p>
+            <w:pPr>
+              <w:jc w:val="left"/>
+            </w:pPr>
+            <w:r>
+              <w:rPr>
+                <w:rFonts w:ascii="Calibri" w:hAnsi="Calibri"/>
+                <w:b w:val="0"/>
+                <w:i w:val="0"/>
+                <w:color w:val="18181B"/>
+                <w:sz w:val="17"/>
               </w:rPr>
               <w:t>R$ 80,500.00</w:t>
             </w:r>
@@ -1279,7 +1339,49 @@
         </w:tc>
         <w:tc>
           <w:tcPr>
-            <w:tcW w:type="dxa" w:w="1656"/>
+            <w:tcW w:type="dxa" w:w="1419"/>
+          </w:tcPr>
+          <w:p>
+            <w:pPr>
+              <w:jc w:val="left"/>
+            </w:pPr>
+            <w:r>
+              <w:rPr>
+                <w:rFonts w:ascii="Calibri" w:hAnsi="Calibri"/>
+                <w:b w:val="0"/>
+                <w:i w:val="0"/>
+                <w:color w:val="18181B"/>
+                <w:sz w:val="17"/>
+              </w:rPr>
+              <w:t>R$ 98,050.00</w:t>
+            </w:r>
+          </w:p>
+        </w:tc>
+        <w:tc>
+          <w:tcPr>
+            <w:tcW w:type="dxa" w:w="1419"/>
+          </w:tcPr>
+          <w:p>
+            <w:pPr>
+              <w:jc w:val="left"/>
+            </w:pPr>
+            <w:r>
+              <w:rPr>
+                <w:rFonts w:ascii="Calibri" w:hAnsi="Calibri"/>
+                <w:b w:val="0"/>
+                <w:i w:val="0"/>
+                <w:color w:val="18181B"/>
+                <w:sz w:val="17"/>
+              </w:rPr>
+              <w:t>R$ 0.44</w:t>
+            </w:r>
+          </w:p>
+        </w:tc>
+      </w:tr>
+      <w:tr>
+        <w:tc>
+          <w:tcPr>
+            <w:tcW w:type="dxa" w:w="1419"/>
             <w:shd w:fill="F4F4F5"/>
           </w:tcPr>
           <w:p>
@@ -1292,15 +1394,15 @@
                 <w:b w:val="0"/>
                 <w:i w:val="0"/>
                 <w:color w:val="18181B"/>
-                <w:sz w:val="18"/>
+                <w:sz w:val="17"/>
               </w:rPr>
-              <w:t>R$ 93,565.00</w:t>
+              <w:t>Jun/27</w:t>
             </w:r>
           </w:p>
         </w:tc>
         <w:tc>
           <w:tcPr>
-            <w:tcW w:type="dxa" w:w="1656"/>
+            <w:tcW w:type="dxa" w:w="1419"/>
             <w:shd w:fill="F4F4F5"/>
           </w:tcPr>
           <w:p>
@@ -1313,139 +1415,15 @@
                 <w:b w:val="0"/>
                 <w:i w:val="0"/>
                 <w:color w:val="18181B"/>
-                <w:sz w:val="18"/>
+                <w:sz w:val="17"/>
               </w:rPr>
-              <w:t>R$ 0.37</w:t>
-            </w:r>
-          </w:p>
-        </w:tc>
-      </w:tr>
-      <w:tr>
-        <w:tc>
-          <w:tcPr>
-            <w:tcW w:type="dxa" w:w="1656"/>
-          </w:tcPr>
-          <w:p>
-            <w:pPr>
-              <w:jc w:val="left"/>
-            </w:pPr>
-            <w:r>
-              <w:rPr>
-                <w:rFonts w:ascii="Calibri" w:hAnsi="Calibri"/>
-                <w:b w:val="0"/>
-                <w:i w:val="0"/>
-                <w:color w:val="18181B"/>
-                <w:sz w:val="18"/>
-              </w:rPr>
-              <w:t>Jul/27</w:t>
+              <w:t>250,000</w:t>
             </w:r>
           </w:p>
         </w:tc>
         <w:tc>
           <w:tcPr>
-            <w:tcW w:type="dxa" w:w="1656"/>
-          </w:tcPr>
-          <w:p>
-            <w:pPr>
-              <w:jc w:val="left"/>
-            </w:pPr>
-            <w:r>
-              <w:rPr>
-                <w:rFonts w:ascii="Calibri" w:hAnsi="Calibri"/>
-                <w:b w:val="0"/>
-                <w:i w:val="0"/>
-                <w:color w:val="18181B"/>
-                <w:sz w:val="18"/>
-              </w:rPr>
-              <w:t>275,000</w:t>
-            </w:r>
-          </w:p>
-        </w:tc>
-        <w:tc>
-          <w:tcPr>
-            <w:tcW w:type="dxa" w:w="1656"/>
-          </w:tcPr>
-          <w:p>
-            <w:pPr>
-              <w:jc w:val="left"/>
-            </w:pPr>
-            <w:r>
-              <w:rPr>
-                <w:rFonts w:ascii="Calibri" w:hAnsi="Calibri"/>
-                <w:b w:val="0"/>
-                <w:i w:val="0"/>
-                <w:color w:val="18181B"/>
-                <w:sz w:val="18"/>
-              </w:rPr>
-              <w:t>R$ 14,371.50</w:t>
-            </w:r>
-          </w:p>
-        </w:tc>
-        <w:tc>
-          <w:tcPr>
-            <w:tcW w:type="dxa" w:w="1656"/>
-          </w:tcPr>
-          <w:p>
-            <w:pPr>
-              <w:jc w:val="left"/>
-            </w:pPr>
-            <w:r>
-              <w:rPr>
-                <w:rFonts w:ascii="Calibri" w:hAnsi="Calibri"/>
-                <w:b w:val="0"/>
-                <w:i w:val="0"/>
-                <w:color w:val="18181B"/>
-                <w:sz w:val="18"/>
-              </w:rPr>
-              <w:t>R$ 112,500.00</w:t>
-            </w:r>
-          </w:p>
-        </w:tc>
-        <w:tc>
-          <w:tcPr>
-            <w:tcW w:type="dxa" w:w="1656"/>
-          </w:tcPr>
-          <w:p>
-            <w:pPr>
-              <w:jc w:val="left"/>
-            </w:pPr>
-            <w:r>
-              <w:rPr>
-                <w:rFonts w:ascii="Calibri" w:hAnsi="Calibri"/>
-                <w:b w:val="0"/>
-                <w:i w:val="0"/>
-                <w:color w:val="18181B"/>
-                <w:sz w:val="18"/>
-              </w:rPr>
-              <w:t>R$ 126,871.50</w:t>
-            </w:r>
-          </w:p>
-        </w:tc>
-        <w:tc>
-          <w:tcPr>
-            <w:tcW w:type="dxa" w:w="1656"/>
-          </w:tcPr>
-          <w:p>
-            <w:pPr>
-              <w:jc w:val="left"/>
-            </w:pPr>
-            <w:r>
-              <w:rPr>
-                <w:rFonts w:ascii="Calibri" w:hAnsi="Calibri"/>
-                <w:b w:val="0"/>
-                <w:i w:val="0"/>
-                <w:color w:val="18181B"/>
-                <w:sz w:val="18"/>
-              </w:rPr>
-              <w:t>R$ 0.46</w:t>
-            </w:r>
-          </w:p>
-        </w:tc>
-      </w:tr>
-      <w:tr>
-        <w:tc>
-          <w:tcPr>
-            <w:tcW w:type="dxa" w:w="1656"/>
+            <w:tcW w:type="dxa" w:w="1419"/>
             <w:shd w:fill="F4F4F5"/>
           </w:tcPr>
           <w:p>
@@ -1458,15 +1436,15 @@
                 <w:b w:val="0"/>
                 <w:i w:val="0"/>
                 <w:color w:val="18181B"/>
-                <w:sz w:val="18"/>
+                <w:sz w:val="17"/>
               </w:rPr>
-              <w:t>Ago/27</w:t>
+              <w:t>R$ 12,000.00</w:t>
             </w:r>
           </w:p>
         </w:tc>
         <w:tc>
           <w:tcPr>
-            <w:tcW w:type="dxa" w:w="1656"/>
+            <w:tcW w:type="dxa" w:w="1419"/>
             <w:shd w:fill="F4F4F5"/>
           </w:tcPr>
           <w:p>
@@ -1479,15 +1457,15 @@
                 <w:b w:val="0"/>
                 <w:i w:val="0"/>
                 <w:color w:val="18181B"/>
-                <w:sz w:val="18"/>
+                <w:sz w:val="17"/>
               </w:rPr>
-              <w:t>300,000</w:t>
+              <w:t>R$ 19,500.00</w:t>
             </w:r>
           </w:p>
         </w:tc>
         <w:tc>
           <w:tcPr>
-            <w:tcW w:type="dxa" w:w="1656"/>
+            <w:tcW w:type="dxa" w:w="1419"/>
             <w:shd w:fill="F4F4F5"/>
           </w:tcPr>
           <w:p>
@@ -1500,15 +1478,15 @@
                 <w:b w:val="0"/>
                 <w:i w:val="0"/>
                 <w:color w:val="18181B"/>
-                <w:sz w:val="18"/>
+                <w:sz w:val="17"/>
               </w:rPr>
-              <w:t>R$ 15,678.00</w:t>
+              <w:t>R$ 80,500.00</w:t>
             </w:r>
           </w:p>
         </w:tc>
         <w:tc>
           <w:tcPr>
-            <w:tcW w:type="dxa" w:w="1656"/>
+            <w:tcW w:type="dxa" w:w="1419"/>
             <w:shd w:fill="F4F4F5"/>
           </w:tcPr>
           <w:p>
@@ -1521,15 +1499,15 @@
                 <w:b w:val="0"/>
                 <w:i w:val="0"/>
                 <w:color w:val="18181B"/>
-                <w:sz w:val="18"/>
+                <w:sz w:val="17"/>
               </w:rPr>
-              <w:t>R$ 112,500.00</w:t>
+              <w:t>R$ 100,000.00</w:t>
             </w:r>
           </w:p>
         </w:tc>
         <w:tc>
           <w:tcPr>
-            <w:tcW w:type="dxa" w:w="1656"/>
+            <w:tcW w:type="dxa" w:w="1419"/>
             <w:shd w:fill="F4F4F5"/>
           </w:tcPr>
           <w:p>
@@ -1542,15 +1520,159 @@
                 <w:b w:val="0"/>
                 <w:i w:val="0"/>
                 <w:color w:val="18181B"/>
-                <w:sz w:val="18"/>
+                <w:sz w:val="17"/>
               </w:rPr>
-              <w:t>R$ 128,178.00</w:t>
+              <w:t>R$ 0.40</w:t>
+            </w:r>
+          </w:p>
+        </w:tc>
+      </w:tr>
+      <w:tr>
+        <w:tc>
+          <w:tcPr>
+            <w:tcW w:type="dxa" w:w="1419"/>
+          </w:tcPr>
+          <w:p>
+            <w:pPr>
+              <w:jc w:val="left"/>
+            </w:pPr>
+            <w:r>
+              <w:rPr>
+                <w:rFonts w:ascii="Calibri" w:hAnsi="Calibri"/>
+                <w:b w:val="0"/>
+                <w:i w:val="0"/>
+                <w:color w:val="18181B"/>
+                <w:sz w:val="17"/>
+              </w:rPr>
+              <w:t>Jul/27</w:t>
             </w:r>
           </w:p>
         </w:tc>
         <w:tc>
           <w:tcPr>
-            <w:tcW w:type="dxa" w:w="1656"/>
+            <w:tcW w:type="dxa" w:w="1419"/>
+          </w:tcPr>
+          <w:p>
+            <w:pPr>
+              <w:jc w:val="left"/>
+            </w:pPr>
+            <w:r>
+              <w:rPr>
+                <w:rFonts w:ascii="Calibri" w:hAnsi="Calibri"/>
+                <w:b w:val="0"/>
+                <w:i w:val="0"/>
+                <w:color w:val="18181B"/>
+                <w:sz w:val="17"/>
+              </w:rPr>
+              <w:t>275,000</w:t>
+            </w:r>
+          </w:p>
+        </w:tc>
+        <w:tc>
+          <w:tcPr>
+            <w:tcW w:type="dxa" w:w="1419"/>
+          </w:tcPr>
+          <w:p>
+            <w:pPr>
+              <w:jc w:val="left"/>
+            </w:pPr>
+            <w:r>
+              <w:rPr>
+                <w:rFonts w:ascii="Calibri" w:hAnsi="Calibri"/>
+                <w:b w:val="0"/>
+                <w:i w:val="0"/>
+                <w:color w:val="18181B"/>
+                <w:sz w:val="17"/>
+              </w:rPr>
+              <w:t>R$ 13,200.00</w:t>
+            </w:r>
+          </w:p>
+        </w:tc>
+        <w:tc>
+          <w:tcPr>
+            <w:tcW w:type="dxa" w:w="1419"/>
+          </w:tcPr>
+          <w:p>
+            <w:pPr>
+              <w:jc w:val="left"/>
+            </w:pPr>
+            <w:r>
+              <w:rPr>
+                <w:rFonts w:ascii="Calibri" w:hAnsi="Calibri"/>
+                <w:b w:val="0"/>
+                <w:i w:val="0"/>
+                <w:color w:val="18181B"/>
+                <w:sz w:val="17"/>
+              </w:rPr>
+              <w:t>R$ 21,450.00</w:t>
+            </w:r>
+          </w:p>
+        </w:tc>
+        <w:tc>
+          <w:tcPr>
+            <w:tcW w:type="dxa" w:w="1419"/>
+          </w:tcPr>
+          <w:p>
+            <w:pPr>
+              <w:jc w:val="left"/>
+            </w:pPr>
+            <w:r>
+              <w:rPr>
+                <w:rFonts w:ascii="Calibri" w:hAnsi="Calibri"/>
+                <w:b w:val="0"/>
+                <w:i w:val="0"/>
+                <w:color w:val="18181B"/>
+                <w:sz w:val="17"/>
+              </w:rPr>
+              <w:t>R$ 112,500.00</w:t>
+            </w:r>
+          </w:p>
+        </w:tc>
+        <w:tc>
+          <w:tcPr>
+            <w:tcW w:type="dxa" w:w="1419"/>
+          </w:tcPr>
+          <w:p>
+            <w:pPr>
+              <w:jc w:val="left"/>
+            </w:pPr>
+            <w:r>
+              <w:rPr>
+                <w:rFonts w:ascii="Calibri" w:hAnsi="Calibri"/>
+                <w:b w:val="0"/>
+                <w:i w:val="0"/>
+                <w:color w:val="18181B"/>
+                <w:sz w:val="17"/>
+              </w:rPr>
+              <w:t>R$ 133,950.00</w:t>
+            </w:r>
+          </w:p>
+        </w:tc>
+        <w:tc>
+          <w:tcPr>
+            <w:tcW w:type="dxa" w:w="1419"/>
+          </w:tcPr>
+          <w:p>
+            <w:pPr>
+              <w:jc w:val="left"/>
+            </w:pPr>
+            <w:r>
+              <w:rPr>
+                <w:rFonts w:ascii="Calibri" w:hAnsi="Calibri"/>
+                <w:b w:val="0"/>
+                <w:i w:val="0"/>
+                <w:color w:val="18181B"/>
+                <w:sz w:val="17"/>
+              </w:rPr>
+              <w:t>R$ 0.49</w:t>
+            </w:r>
+          </w:p>
+        </w:tc>
+      </w:tr>
+      <w:tr>
+        <w:tc>
+          <w:tcPr>
+            <w:tcW w:type="dxa" w:w="1419"/>
             <w:shd w:fill="F4F4F5"/>
           </w:tcPr>
           <w:p>
@@ -1563,139 +1685,15 @@
                 <w:b w:val="0"/>
                 <w:i w:val="0"/>
                 <w:color w:val="18181B"/>
-                <w:sz w:val="18"/>
+                <w:sz w:val="17"/>
               </w:rPr>
-              <w:t>R$ 0.43</w:t>
-            </w:r>
-          </w:p>
-        </w:tc>
-      </w:tr>
-      <w:tr>
-        <w:tc>
-          <w:tcPr>
-            <w:tcW w:type="dxa" w:w="1656"/>
-          </w:tcPr>
-          <w:p>
-            <w:pPr>
-              <w:jc w:val="left"/>
-            </w:pPr>
-            <w:r>
-              <w:rPr>
-                <w:rFonts w:ascii="Calibri" w:hAnsi="Calibri"/>
-                <w:b w:val="0"/>
-                <w:i w:val="0"/>
-                <w:color w:val="18181B"/>
-                <w:sz w:val="18"/>
-              </w:rPr>
-              <w:t>Set/27</w:t>
+              <w:t>Ago/27</w:t>
             </w:r>
           </w:p>
         </w:tc>
         <w:tc>
           <w:tcPr>
-            <w:tcW w:type="dxa" w:w="1656"/>
-          </w:tcPr>
-          <w:p>
-            <w:pPr>
-              <w:jc w:val="left"/>
-            </w:pPr>
-            <w:r>
-              <w:rPr>
-                <w:rFonts w:ascii="Calibri" w:hAnsi="Calibri"/>
-                <w:b w:val="0"/>
-                <w:i w:val="0"/>
-                <w:color w:val="18181B"/>
-                <w:sz w:val="18"/>
-              </w:rPr>
-              <w:t>350,000</w:t>
-            </w:r>
-          </w:p>
-        </w:tc>
-        <w:tc>
-          <w:tcPr>
-            <w:tcW w:type="dxa" w:w="1656"/>
-          </w:tcPr>
-          <w:p>
-            <w:pPr>
-              <w:jc w:val="left"/>
-            </w:pPr>
-            <w:r>
-              <w:rPr>
-                <w:rFonts w:ascii="Calibri" w:hAnsi="Calibri"/>
-                <w:b w:val="0"/>
-                <w:i w:val="0"/>
-                <w:color w:val="18181B"/>
-                <w:sz w:val="18"/>
-              </w:rPr>
-              <w:t>R$ 18,291.00</w:t>
-            </w:r>
-          </w:p>
-        </w:tc>
-        <w:tc>
-          <w:tcPr>
-            <w:tcW w:type="dxa" w:w="1656"/>
-          </w:tcPr>
-          <w:p>
-            <w:pPr>
-              <w:jc w:val="left"/>
-            </w:pPr>
-            <w:r>
-              <w:rPr>
-                <w:rFonts w:ascii="Calibri" w:hAnsi="Calibri"/>
-                <w:b w:val="0"/>
-                <w:i w:val="0"/>
-                <w:color w:val="18181B"/>
-                <w:sz w:val="18"/>
-              </w:rPr>
-              <w:t>R$ 112,500.00</w:t>
-            </w:r>
-          </w:p>
-        </w:tc>
-        <w:tc>
-          <w:tcPr>
-            <w:tcW w:type="dxa" w:w="1656"/>
-          </w:tcPr>
-          <w:p>
-            <w:pPr>
-              <w:jc w:val="left"/>
-            </w:pPr>
-            <w:r>
-              <w:rPr>
-                <w:rFonts w:ascii="Calibri" w:hAnsi="Calibri"/>
-                <w:b w:val="0"/>
-                <w:i w:val="0"/>
-                <w:color w:val="18181B"/>
-                <w:sz w:val="18"/>
-              </w:rPr>
-              <w:t>R$ 130,791.00</w:t>
-            </w:r>
-          </w:p>
-        </w:tc>
-        <w:tc>
-          <w:tcPr>
-            <w:tcW w:type="dxa" w:w="1656"/>
-          </w:tcPr>
-          <w:p>
-            <w:pPr>
-              <w:jc w:val="left"/>
-            </w:pPr>
-            <w:r>
-              <w:rPr>
-                <w:rFonts w:ascii="Calibri" w:hAnsi="Calibri"/>
-                <w:b w:val="0"/>
-                <w:i w:val="0"/>
-                <w:color w:val="18181B"/>
-                <w:sz w:val="18"/>
-              </w:rPr>
-              <w:t>R$ 0.37</w:t>
-            </w:r>
-          </w:p>
-        </w:tc>
-      </w:tr>
-      <w:tr>
-        <w:tc>
-          <w:tcPr>
-            <w:tcW w:type="dxa" w:w="1656"/>
+            <w:tcW w:type="dxa" w:w="1419"/>
             <w:shd w:fill="F4F4F5"/>
           </w:tcPr>
           <w:p>
@@ -1708,15 +1706,15 @@
                 <w:b w:val="0"/>
                 <w:i w:val="0"/>
                 <w:color w:val="18181B"/>
-                <w:sz w:val="18"/>
+                <w:sz w:val="17"/>
               </w:rPr>
-              <w:t>Out/27</w:t>
+              <w:t>300,000</w:t>
             </w:r>
           </w:p>
         </w:tc>
         <w:tc>
           <w:tcPr>
-            <w:tcW w:type="dxa" w:w="1656"/>
+            <w:tcW w:type="dxa" w:w="1419"/>
             <w:shd w:fill="F4F4F5"/>
           </w:tcPr>
           <w:p>
@@ -1729,15 +1727,15 @@
                 <w:b w:val="0"/>
                 <w:i w:val="0"/>
                 <w:color w:val="18181B"/>
-                <w:sz w:val="18"/>
+                <w:sz w:val="17"/>
               </w:rPr>
-              <w:t>400,000</w:t>
+              <w:t>R$ 14,400.00</w:t>
             </w:r>
           </w:p>
         </w:tc>
         <w:tc>
           <w:tcPr>
-            <w:tcW w:type="dxa" w:w="1656"/>
+            <w:tcW w:type="dxa" w:w="1419"/>
             <w:shd w:fill="F4F4F5"/>
           </w:tcPr>
           <w:p>
@@ -1750,15 +1748,15 @@
                 <w:b w:val="0"/>
                 <w:i w:val="0"/>
                 <w:color w:val="18181B"/>
-                <w:sz w:val="18"/>
+                <w:sz w:val="17"/>
               </w:rPr>
-              <w:t>R$ 20,904.00</w:t>
+              <w:t>R$ 23,400.00</w:t>
             </w:r>
           </w:p>
         </w:tc>
         <w:tc>
           <w:tcPr>
-            <w:tcW w:type="dxa" w:w="1656"/>
+            <w:tcW w:type="dxa" w:w="1419"/>
             <w:shd w:fill="F4F4F5"/>
           </w:tcPr>
           <w:p>
@@ -1771,7 +1769,7 @@
                 <w:b w:val="0"/>
                 <w:i w:val="0"/>
                 <w:color w:val="18181B"/>
-                <w:sz w:val="18"/>
+                <w:sz w:val="17"/>
               </w:rPr>
               <w:t>R$ 112,500.00</w:t>
             </w:r>
@@ -1779,7 +1777,7 @@
         </w:tc>
         <w:tc>
           <w:tcPr>
-            <w:tcW w:type="dxa" w:w="1656"/>
+            <w:tcW w:type="dxa" w:w="1419"/>
             <w:shd w:fill="F4F4F5"/>
           </w:tcPr>
           <w:p>
@@ -1792,15 +1790,15 @@
                 <w:b w:val="0"/>
                 <w:i w:val="0"/>
                 <w:color w:val="18181B"/>
-                <w:sz w:val="18"/>
+                <w:sz w:val="17"/>
               </w:rPr>
-              <w:t>R$ 133,404.00</w:t>
+              <w:t>R$ 135,900.00</w:t>
             </w:r>
           </w:p>
         </w:tc>
         <w:tc>
           <w:tcPr>
-            <w:tcW w:type="dxa" w:w="1656"/>
+            <w:tcW w:type="dxa" w:w="1419"/>
             <w:shd w:fill="F4F4F5"/>
           </w:tcPr>
           <w:p>
@@ -1813,9 +1811,9 @@
                 <w:b w:val="0"/>
                 <w:i w:val="0"/>
                 <w:color w:val="18181B"/>
-                <w:sz w:val="18"/>
+                <w:sz w:val="17"/>
               </w:rPr>
-              <w:t>R$ 0.33</w:t>
+              <w:t>R$ 0.45</w:t>
             </w:r>
           </w:p>
         </w:tc>
@@ -1823,7 +1821,7 @@
       <w:tr>
         <w:tc>
           <w:tcPr>
-            <w:tcW w:type="dxa" w:w="1656"/>
+            <w:tcW w:type="dxa" w:w="1419"/>
           </w:tcPr>
           <w:p>
             <w:pPr>
@@ -1835,15 +1833,15 @@
                 <w:b w:val="0"/>
                 <w:i w:val="0"/>
                 <w:color w:val="18181B"/>
-                <w:sz w:val="18"/>
+                <w:sz w:val="17"/>
               </w:rPr>
-              <w:t>Nov/27</w:t>
+              <w:t>Set/27</w:t>
             </w:r>
           </w:p>
         </w:tc>
         <w:tc>
           <w:tcPr>
-            <w:tcW w:type="dxa" w:w="1656"/>
+            <w:tcW w:type="dxa" w:w="1419"/>
           </w:tcPr>
           <w:p>
             <w:pPr>
@@ -1855,15 +1853,15 @@
                 <w:b w:val="0"/>
                 <w:i w:val="0"/>
                 <w:color w:val="18181B"/>
-                <w:sz w:val="18"/>
+                <w:sz w:val="17"/>
               </w:rPr>
-              <w:t>450,000</w:t>
+              <w:t>350,000</w:t>
             </w:r>
           </w:p>
         </w:tc>
         <w:tc>
           <w:tcPr>
-            <w:tcW w:type="dxa" w:w="1656"/>
+            <w:tcW w:type="dxa" w:w="1419"/>
           </w:tcPr>
           <w:p>
             <w:pPr>
@@ -1875,15 +1873,15 @@
                 <w:b w:val="0"/>
                 <w:i w:val="0"/>
                 <w:color w:val="18181B"/>
-                <w:sz w:val="18"/>
+                <w:sz w:val="17"/>
               </w:rPr>
-              <w:t>R$ 23,517.00</w:t>
+              <w:t>R$ 16,800.00</w:t>
             </w:r>
           </w:p>
         </w:tc>
         <w:tc>
           <w:tcPr>
-            <w:tcW w:type="dxa" w:w="1656"/>
+            <w:tcW w:type="dxa" w:w="1419"/>
           </w:tcPr>
           <w:p>
             <w:pPr>
@@ -1895,15 +1893,15 @@
                 <w:b w:val="0"/>
                 <w:i w:val="0"/>
                 <w:color w:val="18181B"/>
-                <w:sz w:val="18"/>
+                <w:sz w:val="17"/>
               </w:rPr>
-              <w:t>R$ 112,500.00</w:t>
+              <w:t>R$ 27,300.00</w:t>
             </w:r>
           </w:p>
         </w:tc>
         <w:tc>
           <w:tcPr>
-            <w:tcW w:type="dxa" w:w="1656"/>
+            <w:tcW w:type="dxa" w:w="1419"/>
           </w:tcPr>
           <w:p>
             <w:pPr>
@@ -1915,15 +1913,15 @@
                 <w:b w:val="0"/>
                 <w:i w:val="0"/>
                 <w:color w:val="18181B"/>
-                <w:sz w:val="18"/>
+                <w:sz w:val="17"/>
               </w:rPr>
-              <w:t>R$ 136,017.00</w:t>
+              <w:t>R$ 112,500.00</w:t>
             </w:r>
           </w:p>
         </w:tc>
         <w:tc>
           <w:tcPr>
-            <w:tcW w:type="dxa" w:w="1656"/>
+            <w:tcW w:type="dxa" w:w="1419"/>
           </w:tcPr>
           <w:p>
             <w:pPr>
@@ -1935,9 +1933,29 @@
                 <w:b w:val="0"/>
                 <w:i w:val="0"/>
                 <w:color w:val="18181B"/>
-                <w:sz w:val="18"/>
+                <w:sz w:val="17"/>
               </w:rPr>
-              <w:t>R$ 0.30</w:t>
+              <w:t>R$ 139,800.00</w:t>
+            </w:r>
+          </w:p>
+        </w:tc>
+        <w:tc>
+          <w:tcPr>
+            <w:tcW w:type="dxa" w:w="1419"/>
+          </w:tcPr>
+          <w:p>
+            <w:pPr>
+              <w:jc w:val="left"/>
+            </w:pPr>
+            <w:r>
+              <w:rPr>
+                <w:rFonts w:ascii="Calibri" w:hAnsi="Calibri"/>
+                <w:b w:val="0"/>
+                <w:i w:val="0"/>
+                <w:color w:val="18181B"/>
+                <w:sz w:val="17"/>
+              </w:rPr>
+              <w:t>R$ 0.40</w:t>
             </w:r>
           </w:p>
         </w:tc>
@@ -1945,7 +1963,7 @@
       <w:tr>
         <w:tc>
           <w:tcPr>
-            <w:tcW w:type="dxa" w:w="1656"/>
+            <w:tcW w:type="dxa" w:w="1419"/>
             <w:shd w:fill="F4F4F5"/>
           </w:tcPr>
           <w:p>
@@ -1958,15 +1976,15 @@
                 <w:b w:val="0"/>
                 <w:i w:val="0"/>
                 <w:color w:val="18181B"/>
-                <w:sz w:val="18"/>
+                <w:sz w:val="17"/>
               </w:rPr>
-              <w:t>Dez/27</w:t>
+              <w:t>Out/27</w:t>
             </w:r>
           </w:p>
         </w:tc>
         <w:tc>
           <w:tcPr>
-            <w:tcW w:type="dxa" w:w="1656"/>
+            <w:tcW w:type="dxa" w:w="1419"/>
             <w:shd w:fill="F4F4F5"/>
           </w:tcPr>
           <w:p>
@@ -1979,15 +1997,15 @@
                 <w:b w:val="0"/>
                 <w:i w:val="0"/>
                 <w:color w:val="18181B"/>
-                <w:sz w:val="18"/>
+                <w:sz w:val="17"/>
               </w:rPr>
-              <w:t>500,000</w:t>
+              <w:t>400,000</w:t>
             </w:r>
           </w:p>
         </w:tc>
         <w:tc>
           <w:tcPr>
-            <w:tcW w:type="dxa" w:w="1656"/>
+            <w:tcW w:type="dxa" w:w="1419"/>
             <w:shd w:fill="F4F4F5"/>
           </w:tcPr>
           <w:p>
@@ -2000,15 +2018,15 @@
                 <w:b w:val="0"/>
                 <w:i w:val="0"/>
                 <w:color w:val="18181B"/>
-                <w:sz w:val="18"/>
+                <w:sz w:val="17"/>
               </w:rPr>
-              <w:t>R$ 26,130.00</w:t>
+              <w:t>R$ 19,200.00</w:t>
             </w:r>
           </w:p>
         </w:tc>
         <w:tc>
           <w:tcPr>
-            <w:tcW w:type="dxa" w:w="1656"/>
+            <w:tcW w:type="dxa" w:w="1419"/>
             <w:shd w:fill="F4F4F5"/>
           </w:tcPr>
           <w:p>
@@ -2021,15 +2039,15 @@
                 <w:b w:val="0"/>
                 <w:i w:val="0"/>
                 <w:color w:val="18181B"/>
-                <w:sz w:val="18"/>
+                <w:sz w:val="17"/>
               </w:rPr>
-              <w:t>R$ 112,500.00</w:t>
+              <w:t>R$ 31,200.00</w:t>
             </w:r>
           </w:p>
         </w:tc>
         <w:tc>
           <w:tcPr>
-            <w:tcW w:type="dxa" w:w="1656"/>
+            <w:tcW w:type="dxa" w:w="1419"/>
             <w:shd w:fill="F4F4F5"/>
           </w:tcPr>
           <w:p>
@@ -2042,15 +2060,15 @@
                 <w:b w:val="0"/>
                 <w:i w:val="0"/>
                 <w:color w:val="18181B"/>
-                <w:sz w:val="18"/>
+                <w:sz w:val="17"/>
               </w:rPr>
-              <w:t>R$ 138,630.00</w:t>
+              <w:t>R$ 112,500.00</w:t>
             </w:r>
           </w:p>
         </w:tc>
         <w:tc>
           <w:tcPr>
-            <w:tcW w:type="dxa" w:w="1656"/>
+            <w:tcW w:type="dxa" w:w="1419"/>
             <w:shd w:fill="F4F4F5"/>
           </w:tcPr>
           <w:p>
@@ -2063,9 +2081,321 @@
                 <w:b w:val="0"/>
                 <w:i w:val="0"/>
                 <w:color w:val="18181B"/>
-                <w:sz w:val="18"/>
+                <w:sz w:val="17"/>
               </w:rPr>
-              <w:t>R$ 0.28</w:t>
+              <w:t>R$ 143,700.00</w:t>
+            </w:r>
+          </w:p>
+        </w:tc>
+        <w:tc>
+          <w:tcPr>
+            <w:tcW w:type="dxa" w:w="1419"/>
+            <w:shd w:fill="F4F4F5"/>
+          </w:tcPr>
+          <w:p>
+            <w:pPr>
+              <w:jc w:val="left"/>
+            </w:pPr>
+            <w:r>
+              <w:rPr>
+                <w:rFonts w:ascii="Calibri" w:hAnsi="Calibri"/>
+                <w:b w:val="0"/>
+                <w:i w:val="0"/>
+                <w:color w:val="18181B"/>
+                <w:sz w:val="17"/>
+              </w:rPr>
+              <w:t>R$ 0.36</w:t>
+            </w:r>
+          </w:p>
+        </w:tc>
+      </w:tr>
+      <w:tr>
+        <w:tc>
+          <w:tcPr>
+            <w:tcW w:type="dxa" w:w="1419"/>
+          </w:tcPr>
+          <w:p>
+            <w:pPr>
+              <w:jc w:val="left"/>
+            </w:pPr>
+            <w:r>
+              <w:rPr>
+                <w:rFonts w:ascii="Calibri" w:hAnsi="Calibri"/>
+                <w:b w:val="0"/>
+                <w:i w:val="0"/>
+                <w:color w:val="18181B"/>
+                <w:sz w:val="17"/>
+              </w:rPr>
+              <w:t>Nov/27</w:t>
+            </w:r>
+          </w:p>
+        </w:tc>
+        <w:tc>
+          <w:tcPr>
+            <w:tcW w:type="dxa" w:w="1419"/>
+          </w:tcPr>
+          <w:p>
+            <w:pPr>
+              <w:jc w:val="left"/>
+            </w:pPr>
+            <w:r>
+              <w:rPr>
+                <w:rFonts w:ascii="Calibri" w:hAnsi="Calibri"/>
+                <w:b w:val="0"/>
+                <w:i w:val="0"/>
+                <w:color w:val="18181B"/>
+                <w:sz w:val="17"/>
+              </w:rPr>
+              <w:t>450,000</w:t>
+            </w:r>
+          </w:p>
+        </w:tc>
+        <w:tc>
+          <w:tcPr>
+            <w:tcW w:type="dxa" w:w="1419"/>
+          </w:tcPr>
+          <w:p>
+            <w:pPr>
+              <w:jc w:val="left"/>
+            </w:pPr>
+            <w:r>
+              <w:rPr>
+                <w:rFonts w:ascii="Calibri" w:hAnsi="Calibri"/>
+                <w:b w:val="0"/>
+                <w:i w:val="0"/>
+                <w:color w:val="18181B"/>
+                <w:sz w:val="17"/>
+              </w:rPr>
+              <w:t>R$ 21,600.00</w:t>
+            </w:r>
+          </w:p>
+        </w:tc>
+        <w:tc>
+          <w:tcPr>
+            <w:tcW w:type="dxa" w:w="1419"/>
+          </w:tcPr>
+          <w:p>
+            <w:pPr>
+              <w:jc w:val="left"/>
+            </w:pPr>
+            <w:r>
+              <w:rPr>
+                <w:rFonts w:ascii="Calibri" w:hAnsi="Calibri"/>
+                <w:b w:val="0"/>
+                <w:i w:val="0"/>
+                <w:color w:val="18181B"/>
+                <w:sz w:val="17"/>
+              </w:rPr>
+              <w:t>R$ 35,100.00</w:t>
+            </w:r>
+          </w:p>
+        </w:tc>
+        <w:tc>
+          <w:tcPr>
+            <w:tcW w:type="dxa" w:w="1419"/>
+          </w:tcPr>
+          <w:p>
+            <w:pPr>
+              <w:jc w:val="left"/>
+            </w:pPr>
+            <w:r>
+              <w:rPr>
+                <w:rFonts w:ascii="Calibri" w:hAnsi="Calibri"/>
+                <w:b w:val="0"/>
+                <w:i w:val="0"/>
+                <w:color w:val="18181B"/>
+                <w:sz w:val="17"/>
+              </w:rPr>
+              <w:t>R$ 112,500.00</w:t>
+            </w:r>
+          </w:p>
+        </w:tc>
+        <w:tc>
+          <w:tcPr>
+            <w:tcW w:type="dxa" w:w="1419"/>
+          </w:tcPr>
+          <w:p>
+            <w:pPr>
+              <w:jc w:val="left"/>
+            </w:pPr>
+            <w:r>
+              <w:rPr>
+                <w:rFonts w:ascii="Calibri" w:hAnsi="Calibri"/>
+                <w:b w:val="0"/>
+                <w:i w:val="0"/>
+                <w:color w:val="18181B"/>
+                <w:sz w:val="17"/>
+              </w:rPr>
+              <w:t>R$ 147,600.00</w:t>
+            </w:r>
+          </w:p>
+        </w:tc>
+        <w:tc>
+          <w:tcPr>
+            <w:tcW w:type="dxa" w:w="1419"/>
+          </w:tcPr>
+          <w:p>
+            <w:pPr>
+              <w:jc w:val="left"/>
+            </w:pPr>
+            <w:r>
+              <w:rPr>
+                <w:rFonts w:ascii="Calibri" w:hAnsi="Calibri"/>
+                <w:b w:val="0"/>
+                <w:i w:val="0"/>
+                <w:color w:val="18181B"/>
+                <w:sz w:val="17"/>
+              </w:rPr>
+              <w:t>R$ 0.33</w:t>
+            </w:r>
+          </w:p>
+        </w:tc>
+      </w:tr>
+      <w:tr>
+        <w:tc>
+          <w:tcPr>
+            <w:tcW w:type="dxa" w:w="1419"/>
+            <w:shd w:fill="F4F4F5"/>
+          </w:tcPr>
+          <w:p>
+            <w:pPr>
+              <w:jc w:val="left"/>
+            </w:pPr>
+            <w:r>
+              <w:rPr>
+                <w:rFonts w:ascii="Calibri" w:hAnsi="Calibri"/>
+                <w:b w:val="0"/>
+                <w:i w:val="0"/>
+                <w:color w:val="18181B"/>
+                <w:sz w:val="17"/>
+              </w:rPr>
+              <w:t>Dez/27</w:t>
+            </w:r>
+          </w:p>
+        </w:tc>
+        <w:tc>
+          <w:tcPr>
+            <w:tcW w:type="dxa" w:w="1419"/>
+            <w:shd w:fill="F4F4F5"/>
+          </w:tcPr>
+          <w:p>
+            <w:pPr>
+              <w:jc w:val="left"/>
+            </w:pPr>
+            <w:r>
+              <w:rPr>
+                <w:rFonts w:ascii="Calibri" w:hAnsi="Calibri"/>
+                <w:b w:val="0"/>
+                <w:i w:val="0"/>
+                <w:color w:val="18181B"/>
+                <w:sz w:val="17"/>
+              </w:rPr>
+              <w:t>500,000</w:t>
+            </w:r>
+          </w:p>
+        </w:tc>
+        <w:tc>
+          <w:tcPr>
+            <w:tcW w:type="dxa" w:w="1419"/>
+            <w:shd w:fill="F4F4F5"/>
+          </w:tcPr>
+          <w:p>
+            <w:pPr>
+              <w:jc w:val="left"/>
+            </w:pPr>
+            <w:r>
+              <w:rPr>
+                <w:rFonts w:ascii="Calibri" w:hAnsi="Calibri"/>
+                <w:b w:val="0"/>
+                <w:i w:val="0"/>
+                <w:color w:val="18181B"/>
+                <w:sz w:val="17"/>
+              </w:rPr>
+              <w:t>R$ 24,000.00</w:t>
+            </w:r>
+          </w:p>
+        </w:tc>
+        <w:tc>
+          <w:tcPr>
+            <w:tcW w:type="dxa" w:w="1419"/>
+            <w:shd w:fill="F4F4F5"/>
+          </w:tcPr>
+          <w:p>
+            <w:pPr>
+              <w:jc w:val="left"/>
+            </w:pPr>
+            <w:r>
+              <w:rPr>
+                <w:rFonts w:ascii="Calibri" w:hAnsi="Calibri"/>
+                <w:b w:val="0"/>
+                <w:i w:val="0"/>
+                <w:color w:val="18181B"/>
+                <w:sz w:val="17"/>
+              </w:rPr>
+              <w:t>R$ 39,000.00</w:t>
+            </w:r>
+          </w:p>
+        </w:tc>
+        <w:tc>
+          <w:tcPr>
+            <w:tcW w:type="dxa" w:w="1419"/>
+            <w:shd w:fill="F4F4F5"/>
+          </w:tcPr>
+          <w:p>
+            <w:pPr>
+              <w:jc w:val="left"/>
+            </w:pPr>
+            <w:r>
+              <w:rPr>
+                <w:rFonts w:ascii="Calibri" w:hAnsi="Calibri"/>
+                <w:b w:val="0"/>
+                <w:i w:val="0"/>
+                <w:color w:val="18181B"/>
+                <w:sz w:val="17"/>
+              </w:rPr>
+              <w:t>R$ 112,500.00</w:t>
+            </w:r>
+          </w:p>
+        </w:tc>
+        <w:tc>
+          <w:tcPr>
+            <w:tcW w:type="dxa" w:w="1419"/>
+            <w:shd w:fill="F4F4F5"/>
+          </w:tcPr>
+          <w:p>
+            <w:pPr>
+              <w:jc w:val="left"/>
+            </w:pPr>
+            <w:r>
+              <w:rPr>
+                <w:rFonts w:ascii="Calibri" w:hAnsi="Calibri"/>
+                <w:b w:val="0"/>
+                <w:i w:val="0"/>
+                <w:color w:val="18181B"/>
+                <w:sz w:val="17"/>
+              </w:rPr>
+              <w:t>R$ 151,500.00</w:t>
+            </w:r>
+          </w:p>
+        </w:tc>
+        <w:tc>
+          <w:tcPr>
+            <w:tcW w:type="dxa" w:w="1419"/>
+            <w:shd w:fill="F4F4F5"/>
+          </w:tcPr>
+          <w:p>
+            <w:pPr>
+              <w:jc w:val="left"/>
+            </w:pPr>
+            <w:r>
+              <w:rPr>
+                <w:rFonts w:ascii="Calibri" w:hAnsi="Calibri"/>
+                <w:b w:val="0"/>
+                <w:i w:val="0"/>
+                <w:color w:val="18181B"/>
+                <w:sz w:val="17"/>
+              </w:rPr>
+              <w:t>R$ 0.30</w:t>
             </w:r>
           </w:p>
         </w:tc>
@@ -2094,17 +2424,18 @@
         <w:tblLook w:firstColumn="1" w:firstRow="1" w:lastColumn="0" w:lastRow="0" w:noHBand="0" w:noVBand="1" w:val="04A0"/>
       </w:tblPr>
       <w:tblGrid>
-        <w:gridCol w:w="1656"/>
-        <w:gridCol w:w="1656"/>
-        <w:gridCol w:w="1656"/>
-        <w:gridCol w:w="1656"/>
-        <w:gridCol w:w="1656"/>
-        <w:gridCol w:w="1656"/>
+        <w:gridCol w:w="1419"/>
+        <w:gridCol w:w="1419"/>
+        <w:gridCol w:w="1419"/>
+        <w:gridCol w:w="1419"/>
+        <w:gridCol w:w="1419"/>
+        <w:gridCol w:w="1419"/>
+        <w:gridCol w:w="1419"/>
       </w:tblGrid>
       <w:tr>
         <w:tc>
           <w:tcPr>
-            <w:tcW w:type="dxa" w:w="1656"/>
+            <w:tcW w:type="dxa" w:w="1419"/>
             <w:shd w:fill="9333EA"/>
           </w:tcPr>
           <w:p>
@@ -2117,7 +2448,7 @@
                 <w:b/>
                 <w:i w:val="0"/>
                 <w:color w:val="FFFFFF"/>
-                <w:sz w:val="18"/>
+                <w:sz w:val="17"/>
               </w:rPr>
               <w:t>Ano</w:t>
             </w:r>
@@ -2125,7 +2456,7 @@
         </w:tc>
         <w:tc>
           <w:tcPr>
-            <w:tcW w:type="dxa" w:w="1656"/>
+            <w:tcW w:type="dxa" w:w="1419"/>
             <w:shd w:fill="9333EA"/>
           </w:tcPr>
           <w:p>
@@ -2138,7 +2469,7 @@
                 <w:b/>
                 <w:i w:val="0"/>
                 <w:color w:val="FFFFFF"/>
-                <w:sz w:val="18"/>
+                <w:sz w:val="17"/>
               </w:rPr>
               <w:t>Usuários no Fim do Ano</w:t>
             </w:r>
@@ -2146,7 +2477,7 @@
         </w:tc>
         <w:tc>
           <w:tcPr>
-            <w:tcW w:type="dxa" w:w="1656"/>
+            <w:tcW w:type="dxa" w:w="1419"/>
             <w:shd w:fill="9333EA"/>
           </w:tcPr>
           <w:p>
@@ -2159,15 +2490,15 @@
                 <w:b/>
                 <w:i w:val="0"/>
                 <w:color w:val="FFFFFF"/>
-                <w:sz w:val="18"/>
+                <w:sz w:val="17"/>
               </w:rPr>
-              <w:t>Custo Direto Anual (CSP)</w:t>
+              <w:t>Cloud v2.4 Anual</w:t>
             </w:r>
           </w:p>
         </w:tc>
         <w:tc>
           <w:tcPr>
-            <w:tcW w:type="dxa" w:w="1656"/>
+            <w:tcW w:type="dxa" w:w="1419"/>
             <w:shd w:fill="9333EA"/>
           </w:tcPr>
           <w:p>
@@ -2180,15 +2511,15 @@
                 <w:b/>
                 <w:i w:val="0"/>
                 <w:color w:val="FFFFFF"/>
-                <w:sz w:val="18"/>
+                <w:sz w:val="17"/>
               </w:rPr>
-              <w:t>OPEX Anual</w:t>
+              <w:t>Custos Diretos Anuais</w:t>
             </w:r>
           </w:p>
         </w:tc>
         <w:tc>
           <w:tcPr>
-            <w:tcW w:type="dxa" w:w="1656"/>
+            <w:tcW w:type="dxa" w:w="1419"/>
             <w:shd w:fill="9333EA"/>
           </w:tcPr>
           <w:p>
@@ -2201,15 +2532,15 @@
                 <w:b/>
                 <w:i w:val="0"/>
                 <w:color w:val="FFFFFF"/>
-                <w:sz w:val="18"/>
+                <w:sz w:val="17"/>
               </w:rPr>
-              <w:t>Custo Total Anual</w:t>
+              <w:t>OPEX Anual</w:t>
             </w:r>
           </w:p>
         </w:tc>
         <w:tc>
           <w:tcPr>
-            <w:tcW w:type="dxa" w:w="1656"/>
+            <w:tcW w:type="dxa" w:w="1419"/>
             <w:shd w:fill="9333EA"/>
           </w:tcPr>
           <w:p>
@@ -2222,9 +2553,30 @@
                 <w:b/>
                 <w:i w:val="0"/>
                 <w:color w:val="FFFFFF"/>
-                <w:sz w:val="18"/>
+                <w:sz w:val="17"/>
               </w:rPr>
-              <w:t>Custo Médio / Usuário / Mês</w:t>
+              <w:t>Custo Total Anual</w:t>
+            </w:r>
+          </w:p>
+        </w:tc>
+        <w:tc>
+          <w:tcPr>
+            <w:tcW w:type="dxa" w:w="1419"/>
+            <w:shd w:fill="9333EA"/>
+          </w:tcPr>
+          <w:p>
+            <w:pPr>
+              <w:jc w:val="left"/>
+            </w:pPr>
+            <w:r>
+              <w:rPr>
+                <w:rFonts w:ascii="Calibri" w:hAnsi="Calibri"/>
+                <w:b/>
+                <w:i w:val="0"/>
+                <w:color w:val="FFFFFF"/>
+                <w:sz w:val="17"/>
+              </w:rPr>
+              <w:t>Custo Médio / Usuário</w:t>
             </w:r>
           </w:p>
         </w:tc>
@@ -2232,7 +2584,7 @@
       <w:tr>
         <w:tc>
           <w:tcPr>
-            <w:tcW w:type="dxa" w:w="1656"/>
+            <w:tcW w:type="dxa" w:w="1419"/>
             <w:shd w:fill="F4F4F5"/>
           </w:tcPr>
           <w:p>
@@ -2245,7 +2597,7 @@
                 <w:b w:val="0"/>
                 <w:i w:val="0"/>
                 <w:color w:val="18181B"/>
-                <w:sz w:val="18"/>
+                <w:sz w:val="17"/>
               </w:rPr>
               <w:t>2026</w:t>
             </w:r>
@@ -2253,7 +2605,7 @@
         </w:tc>
         <w:tc>
           <w:tcPr>
-            <w:tcW w:type="dxa" w:w="1656"/>
+            <w:tcW w:type="dxa" w:w="1419"/>
             <w:shd w:fill="F4F4F5"/>
           </w:tcPr>
           <w:p>
@@ -2266,7 +2618,7 @@
                 <w:b w:val="0"/>
                 <w:i w:val="0"/>
                 <w:color w:val="18181B"/>
-                <w:sz w:val="18"/>
+                <w:sz w:val="17"/>
               </w:rPr>
               <w:t>10,000</w:t>
             </w:r>
@@ -2274,7 +2626,7 @@
         </w:tc>
         <w:tc>
           <w:tcPr>
-            <w:tcW w:type="dxa" w:w="1656"/>
+            <w:tcW w:type="dxa" w:w="1419"/>
             <w:shd w:fill="F4F4F5"/>
           </w:tcPr>
           <w:p>
@@ -2287,15 +2639,15 @@
                 <w:b w:val="0"/>
                 <w:i w:val="0"/>
                 <w:color w:val="18181B"/>
-                <w:sz w:val="18"/>
+                <w:sz w:val="17"/>
               </w:rPr>
-              <w:t>R$ 1,650.00</w:t>
+              <w:t>R$ 7,500.00</w:t>
             </w:r>
           </w:p>
         </w:tc>
         <w:tc>
           <w:tcPr>
-            <w:tcW w:type="dxa" w:w="1656"/>
+            <w:tcW w:type="dxa" w:w="1419"/>
             <w:shd w:fill="F4F4F5"/>
           </w:tcPr>
           <w:p>
@@ -2308,15 +2660,15 @@
                 <w:b w:val="0"/>
                 <w:i w:val="0"/>
                 <w:color w:val="18181B"/>
-                <w:sz w:val="18"/>
+                <w:sz w:val="17"/>
               </w:rPr>
-              <w:t>R$ 162,000.00</w:t>
+              <w:t>R$ 8,000.00</w:t>
             </w:r>
           </w:p>
         </w:tc>
         <w:tc>
           <w:tcPr>
-            <w:tcW w:type="dxa" w:w="1656"/>
+            <w:tcW w:type="dxa" w:w="1419"/>
             <w:shd w:fill="F4F4F5"/>
           </w:tcPr>
           <w:p>
@@ -2329,15 +2681,15 @@
                 <w:b w:val="0"/>
                 <w:i w:val="0"/>
                 <w:color w:val="18181B"/>
-                <w:sz w:val="18"/>
+                <w:sz w:val="17"/>
               </w:rPr>
-              <w:t>R$ 163,650.00</w:t>
+              <w:t>R$ 162,000.00</w:t>
             </w:r>
           </w:p>
         </w:tc>
         <w:tc>
           <w:tcPr>
-            <w:tcW w:type="dxa" w:w="1656"/>
+            <w:tcW w:type="dxa" w:w="1419"/>
             <w:shd w:fill="F4F4F5"/>
           </w:tcPr>
           <w:p>
@@ -2350,139 +2702,15 @@
                 <w:b w:val="0"/>
                 <w:i w:val="0"/>
                 <w:color w:val="18181B"/>
-                <w:sz w:val="18"/>
+                <w:sz w:val="17"/>
               </w:rPr>
-              <w:t>R$ 201.48</w:t>
-            </w:r>
-          </w:p>
-        </w:tc>
-      </w:tr>
-      <w:tr>
-        <w:tc>
-          <w:tcPr>
-            <w:tcW w:type="dxa" w:w="1656"/>
-          </w:tcPr>
-          <w:p>
-            <w:pPr>
-              <w:jc w:val="left"/>
-            </w:pPr>
-            <w:r>
-              <w:rPr>
-                <w:rFonts w:ascii="Calibri" w:hAnsi="Calibri"/>
-                <w:b w:val="0"/>
-                <w:i w:val="0"/>
-                <w:color w:val="18181B"/>
-                <w:sz w:val="18"/>
-              </w:rPr>
-              <w:t>2027</w:t>
+              <w:t>R$ 170,000.00</w:t>
             </w:r>
           </w:p>
         </w:tc>
         <w:tc>
           <w:tcPr>
-            <w:tcW w:type="dxa" w:w="1656"/>
-          </w:tcPr>
-          <w:p>
-            <w:pPr>
-              <w:jc w:val="left"/>
-            </w:pPr>
-            <w:r>
-              <w:rPr>
-                <w:rFonts w:ascii="Calibri" w:hAnsi="Calibri"/>
-                <w:b w:val="0"/>
-                <w:i w:val="0"/>
-                <w:color w:val="18181B"/>
-                <w:sz w:val="18"/>
-              </w:rPr>
-              <w:t>500,000</w:t>
-            </w:r>
-          </w:p>
-        </w:tc>
-        <w:tc>
-          <w:tcPr>
-            <w:tcW w:type="dxa" w:w="1656"/>
-          </w:tcPr>
-          <w:p>
-            <w:pPr>
-              <w:jc w:val="left"/>
-            </w:pPr>
-            <w:r>
-              <w:rPr>
-                <w:rFonts w:ascii="Calibri" w:hAnsi="Calibri"/>
-                <w:b w:val="0"/>
-                <w:i w:val="0"/>
-                <w:color w:val="18181B"/>
-                <w:sz w:val="18"/>
-              </w:rPr>
-              <w:t>R$ 169,845.00</w:t>
-            </w:r>
-          </w:p>
-        </w:tc>
-        <w:tc>
-          <w:tcPr>
-            <w:tcW w:type="dxa" w:w="1656"/>
-          </w:tcPr>
-          <w:p>
-            <w:pPr>
-              <w:jc w:val="left"/>
-            </w:pPr>
-            <w:r>
-              <w:rPr>
-                <w:rFonts w:ascii="Calibri" w:hAnsi="Calibri"/>
-                <w:b w:val="0"/>
-                <w:i w:val="0"/>
-                <w:color w:val="18181B"/>
-                <w:sz w:val="18"/>
-              </w:rPr>
-              <w:t>R$ 1,158,000.00</w:t>
-            </w:r>
-          </w:p>
-        </w:tc>
-        <w:tc>
-          <w:tcPr>
-            <w:tcW w:type="dxa" w:w="1656"/>
-          </w:tcPr>
-          <w:p>
-            <w:pPr>
-              <w:jc w:val="left"/>
-            </w:pPr>
-            <w:r>
-              <w:rPr>
-                <w:rFonts w:ascii="Calibri" w:hAnsi="Calibri"/>
-                <w:b w:val="0"/>
-                <w:i w:val="0"/>
-                <w:color w:val="18181B"/>
-                <w:sz w:val="18"/>
-              </w:rPr>
-              <w:t>R$ 1,327,845.00</w:t>
-            </w:r>
-          </w:p>
-        </w:tc>
-        <w:tc>
-          <w:tcPr>
-            <w:tcW w:type="dxa" w:w="1656"/>
-          </w:tcPr>
-          <w:p>
-            <w:pPr>
-              <w:jc w:val="left"/>
-            </w:pPr>
-            <w:r>
-              <w:rPr>
-                <w:rFonts w:ascii="Calibri" w:hAnsi="Calibri"/>
-                <w:b w:val="0"/>
-                <w:i w:val="0"/>
-                <w:color w:val="18181B"/>
-                <w:sz w:val="18"/>
-              </w:rPr>
-              <w:t>R$ 0.54</w:t>
-            </w:r>
-          </w:p>
-        </w:tc>
-      </w:tr>
-      <w:tr>
-        <w:tc>
-          <w:tcPr>
-            <w:tcW w:type="dxa" w:w="1656"/>
+            <w:tcW w:type="dxa" w:w="1419"/>
             <w:shd w:fill="F4F4F5"/>
           </w:tcPr>
           <w:p>
@@ -2495,15 +2723,159 @@
                 <w:b w:val="0"/>
                 <w:i w:val="0"/>
                 <w:color w:val="18181B"/>
-                <w:sz w:val="18"/>
+                <w:sz w:val="17"/>
               </w:rPr>
-              <w:t>2028</w:t>
+              <w:t>R$ 209.43</w:t>
+            </w:r>
+          </w:p>
+        </w:tc>
+      </w:tr>
+      <w:tr>
+        <w:tc>
+          <w:tcPr>
+            <w:tcW w:type="dxa" w:w="1419"/>
+          </w:tcPr>
+          <w:p>
+            <w:pPr>
+              <w:jc w:val="left"/>
+            </w:pPr>
+            <w:r>
+              <w:rPr>
+                <w:rFonts w:ascii="Calibri" w:hAnsi="Calibri"/>
+                <w:b w:val="0"/>
+                <w:i w:val="0"/>
+                <w:color w:val="18181B"/>
+                <w:sz w:val="17"/>
+              </w:rPr>
+              <w:t>2027</w:t>
             </w:r>
           </w:p>
         </w:tc>
         <w:tc>
           <w:tcPr>
-            <w:tcW w:type="dxa" w:w="1656"/>
+            <w:tcW w:type="dxa" w:w="1419"/>
+          </w:tcPr>
+          <w:p>
+            <w:pPr>
+              <w:jc w:val="left"/>
+            </w:pPr>
+            <w:r>
+              <w:rPr>
+                <w:rFonts w:ascii="Calibri" w:hAnsi="Calibri"/>
+                <w:b w:val="0"/>
+                <w:i w:val="0"/>
+                <w:color w:val="18181B"/>
+                <w:sz w:val="17"/>
+              </w:rPr>
+              <w:t>500,000</w:t>
+            </w:r>
+          </w:p>
+        </w:tc>
+        <w:tc>
+          <w:tcPr>
+            <w:tcW w:type="dxa" w:w="1419"/>
+          </w:tcPr>
+          <w:p>
+            <w:pPr>
+              <w:jc w:val="left"/>
+            </w:pPr>
+            <w:r>
+              <w:rPr>
+                <w:rFonts w:ascii="Calibri" w:hAnsi="Calibri"/>
+                <w:b w:val="0"/>
+                <w:i w:val="0"/>
+                <w:color w:val="18181B"/>
+                <w:sz w:val="17"/>
+              </w:rPr>
+              <w:t>R$ 156,100.00</w:t>
+            </w:r>
+          </w:p>
+        </w:tc>
+        <w:tc>
+          <w:tcPr>
+            <w:tcW w:type="dxa" w:w="1419"/>
+          </w:tcPr>
+          <w:p>
+            <w:pPr>
+              <w:jc w:val="left"/>
+            </w:pPr>
+            <w:r>
+              <w:rPr>
+                <w:rFonts w:ascii="Calibri" w:hAnsi="Calibri"/>
+                <w:b w:val="0"/>
+                <w:i w:val="0"/>
+                <w:color w:val="18181B"/>
+                <w:sz w:val="17"/>
+              </w:rPr>
+              <w:t>R$ 253,600.00</w:t>
+            </w:r>
+          </w:p>
+        </w:tc>
+        <w:tc>
+          <w:tcPr>
+            <w:tcW w:type="dxa" w:w="1419"/>
+          </w:tcPr>
+          <w:p>
+            <w:pPr>
+              <w:jc w:val="left"/>
+            </w:pPr>
+            <w:r>
+              <w:rPr>
+                <w:rFonts w:ascii="Calibri" w:hAnsi="Calibri"/>
+                <w:b w:val="0"/>
+                <w:i w:val="0"/>
+                <w:color w:val="18181B"/>
+                <w:sz w:val="17"/>
+              </w:rPr>
+              <w:t>R$ 1,158,000.00</w:t>
+            </w:r>
+          </w:p>
+        </w:tc>
+        <w:tc>
+          <w:tcPr>
+            <w:tcW w:type="dxa" w:w="1419"/>
+          </w:tcPr>
+          <w:p>
+            <w:pPr>
+              <w:jc w:val="left"/>
+            </w:pPr>
+            <w:r>
+              <w:rPr>
+                <w:rFonts w:ascii="Calibri" w:hAnsi="Calibri"/>
+                <w:b w:val="0"/>
+                <w:i w:val="0"/>
+                <w:color w:val="18181B"/>
+                <w:sz w:val="17"/>
+              </w:rPr>
+              <w:t>R$ 1,411,600.00</w:t>
+            </w:r>
+          </w:p>
+        </w:tc>
+        <w:tc>
+          <w:tcPr>
+            <w:tcW w:type="dxa" w:w="1419"/>
+          </w:tcPr>
+          <w:p>
+            <w:pPr>
+              <w:jc w:val="left"/>
+            </w:pPr>
+            <w:r>
+              <w:rPr>
+                <w:rFonts w:ascii="Calibri" w:hAnsi="Calibri"/>
+                <w:b w:val="0"/>
+                <w:i w:val="0"/>
+                <w:color w:val="18181B"/>
+                <w:sz w:val="17"/>
+              </w:rPr>
+              <w:t>R$ 0.57</w:t>
+            </w:r>
+          </w:p>
+        </w:tc>
+      </w:tr>
+      <w:tr>
+        <w:tc>
+          <w:tcPr>
+            <w:tcW w:type="dxa" w:w="1419"/>
             <w:shd w:fill="F4F4F5"/>
           </w:tcPr>
           <w:p>
@@ -2516,15 +2888,15 @@
                 <w:b w:val="0"/>
                 <w:i w:val="0"/>
                 <w:color w:val="18181B"/>
-                <w:sz w:val="18"/>
+                <w:sz w:val="17"/>
               </w:rPr>
-              <w:t>1,000,000</w:t>
+              <w:t>2028</w:t>
             </w:r>
           </w:p>
         </w:tc>
         <w:tc>
           <w:tcPr>
-            <w:tcW w:type="dxa" w:w="1656"/>
+            <w:tcW w:type="dxa" w:w="1419"/>
             <w:shd w:fill="F4F4F5"/>
           </w:tcPr>
           <w:p>
@@ -2537,15 +2909,15 @@
                 <w:b w:val="0"/>
                 <w:i w:val="0"/>
                 <w:color w:val="18181B"/>
-                <w:sz w:val="18"/>
+                <w:sz w:val="17"/>
               </w:rPr>
-              <w:t>R$ 483,404.79</w:t>
+              <w:t>1,000,000</w:t>
             </w:r>
           </w:p>
         </w:tc>
         <w:tc>
           <w:tcPr>
-            <w:tcW w:type="dxa" w:w="1656"/>
+            <w:tcW w:type="dxa" w:w="1419"/>
             <w:shd w:fill="F4F4F5"/>
           </w:tcPr>
           <w:p>
@@ -2558,15 +2930,15 @@
                 <w:b w:val="0"/>
                 <w:i w:val="0"/>
                 <w:color w:val="18181B"/>
-                <w:sz w:val="18"/>
+                <w:sz w:val="17"/>
               </w:rPr>
-              <w:t>R$ 2,022,000.00</w:t>
+              <w:t>R$ 443,999.81</w:t>
             </w:r>
           </w:p>
         </w:tc>
         <w:tc>
           <w:tcPr>
-            <w:tcW w:type="dxa" w:w="1656"/>
+            <w:tcW w:type="dxa" w:w="1419"/>
             <w:shd w:fill="F4F4F5"/>
           </w:tcPr>
           <w:p>
@@ -2579,15 +2951,15 @@
                 <w:b w:val="0"/>
                 <w:i w:val="0"/>
                 <w:color w:val="18181B"/>
-                <w:sz w:val="18"/>
+                <w:sz w:val="17"/>
               </w:rPr>
-              <w:t>R$ 2,505,404.79</w:t>
+              <w:t>R$ 721,499.69</w:t>
             </w:r>
           </w:p>
         </w:tc>
         <w:tc>
           <w:tcPr>
-            <w:tcW w:type="dxa" w:w="1656"/>
+            <w:tcW w:type="dxa" w:w="1419"/>
             <w:shd w:fill="F4F4F5"/>
           </w:tcPr>
           <w:p>
@@ -2600,139 +2972,15 @@
                 <w:b w:val="0"/>
                 <w:i w:val="0"/>
                 <w:color w:val="18181B"/>
-                <w:sz w:val="18"/>
+                <w:sz w:val="17"/>
               </w:rPr>
-              <w:t>R$ 0.28</w:t>
-            </w:r>
-          </w:p>
-        </w:tc>
-      </w:tr>
-      <w:tr>
-        <w:tc>
-          <w:tcPr>
-            <w:tcW w:type="dxa" w:w="1656"/>
-          </w:tcPr>
-          <w:p>
-            <w:pPr>
-              <w:jc w:val="left"/>
-            </w:pPr>
-            <w:r>
-              <w:rPr>
-                <w:rFonts w:ascii="Calibri" w:hAnsi="Calibri"/>
-                <w:b w:val="0"/>
-                <w:i w:val="0"/>
-                <w:color w:val="18181B"/>
-                <w:sz w:val="18"/>
-              </w:rPr>
-              <w:t>2029</w:t>
+              <w:t>R$ 2,022,000.00</w:t>
             </w:r>
           </w:p>
         </w:tc>
         <w:tc>
           <w:tcPr>
-            <w:tcW w:type="dxa" w:w="1656"/>
-          </w:tcPr>
-          <w:p>
-            <w:pPr>
-              <w:jc w:val="left"/>
-            </w:pPr>
-            <w:r>
-              <w:rPr>
-                <w:rFonts w:ascii="Calibri" w:hAnsi="Calibri"/>
-                <w:b w:val="0"/>
-                <w:i w:val="0"/>
-                <w:color w:val="18181B"/>
-                <w:sz w:val="18"/>
-              </w:rPr>
-              <w:t>1,750,000</w:t>
-            </w:r>
-          </w:p>
-        </w:tc>
-        <w:tc>
-          <w:tcPr>
-            <w:tcW w:type="dxa" w:w="1656"/>
-          </w:tcPr>
-          <w:p>
-            <w:pPr>
-              <w:jc w:val="left"/>
-            </w:pPr>
-            <w:r>
-              <w:rPr>
-                <w:rFonts w:ascii="Calibri" w:hAnsi="Calibri"/>
-                <w:b w:val="0"/>
-                <w:i w:val="0"/>
-                <w:color w:val="18181B"/>
-                <w:sz w:val="18"/>
-              </w:rPr>
-              <w:t>R$ 881,887.50</w:t>
-            </w:r>
-          </w:p>
-        </w:tc>
-        <w:tc>
-          <w:tcPr>
-            <w:tcW w:type="dxa" w:w="1656"/>
-          </w:tcPr>
-          <w:p>
-            <w:pPr>
-              <w:jc w:val="left"/>
-            </w:pPr>
-            <w:r>
-              <w:rPr>
-                <w:rFonts w:ascii="Calibri" w:hAnsi="Calibri"/>
-                <w:b w:val="0"/>
-                <w:i w:val="0"/>
-                <w:color w:val="18181B"/>
-                <w:sz w:val="18"/>
-              </w:rPr>
-              <w:t>R$ 2,880,000.00</w:t>
-            </w:r>
-          </w:p>
-        </w:tc>
-        <w:tc>
-          <w:tcPr>
-            <w:tcW w:type="dxa" w:w="1656"/>
-          </w:tcPr>
-          <w:p>
-            <w:pPr>
-              <w:jc w:val="left"/>
-            </w:pPr>
-            <w:r>
-              <w:rPr>
-                <w:rFonts w:ascii="Calibri" w:hAnsi="Calibri"/>
-                <w:b w:val="0"/>
-                <w:i w:val="0"/>
-                <w:color w:val="18181B"/>
-                <w:sz w:val="18"/>
-              </w:rPr>
-              <w:t>R$ 3,761,887.50</w:t>
-            </w:r>
-          </w:p>
-        </w:tc>
-        <w:tc>
-          <w:tcPr>
-            <w:tcW w:type="dxa" w:w="1656"/>
-          </w:tcPr>
-          <w:p>
-            <w:pPr>
-              <w:jc w:val="left"/>
-            </w:pPr>
-            <w:r>
-              <w:rPr>
-                <w:rFonts w:ascii="Calibri" w:hAnsi="Calibri"/>
-                <w:b w:val="0"/>
-                <w:i w:val="0"/>
-                <w:color w:val="18181B"/>
-                <w:sz w:val="18"/>
-              </w:rPr>
-              <w:t>R$ 0.23</w:t>
-            </w:r>
-          </w:p>
-        </w:tc>
-      </w:tr>
-      <w:tr>
-        <w:tc>
-          <w:tcPr>
-            <w:tcW w:type="dxa" w:w="1656"/>
+            <w:tcW w:type="dxa" w:w="1419"/>
             <w:shd w:fill="F4F4F5"/>
           </w:tcPr>
           <w:p>
@@ -2745,15 +2993,15 @@
                 <w:b w:val="0"/>
                 <w:i w:val="0"/>
                 <w:color w:val="18181B"/>
-                <w:sz w:val="18"/>
+                <w:sz w:val="17"/>
               </w:rPr>
-              <w:t>2030</w:t>
+              <w:t>R$ 2,743,499.69</w:t>
             </w:r>
           </w:p>
         </w:tc>
         <w:tc>
           <w:tcPr>
-            <w:tcW w:type="dxa" w:w="1656"/>
+            <w:tcW w:type="dxa" w:w="1419"/>
             <w:shd w:fill="F4F4F5"/>
           </w:tcPr>
           <w:p>
@@ -2766,15 +3014,159 @@
                 <w:b w:val="0"/>
                 <w:i w:val="0"/>
                 <w:color w:val="18181B"/>
-                <w:sz w:val="18"/>
+                <w:sz w:val="17"/>
               </w:rPr>
-              <w:t>2,500,000</w:t>
+              <w:t>R$ 0.30</w:t>
+            </w:r>
+          </w:p>
+        </w:tc>
+      </w:tr>
+      <w:tr>
+        <w:tc>
+          <w:tcPr>
+            <w:tcW w:type="dxa" w:w="1419"/>
+          </w:tcPr>
+          <w:p>
+            <w:pPr>
+              <w:jc w:val="left"/>
+            </w:pPr>
+            <w:r>
+              <w:rPr>
+                <w:rFonts w:ascii="Calibri" w:hAnsi="Calibri"/>
+                <w:b w:val="0"/>
+                <w:i w:val="0"/>
+                <w:color w:val="18181B"/>
+                <w:sz w:val="17"/>
+              </w:rPr>
+              <w:t>2029</w:t>
             </w:r>
           </w:p>
         </w:tc>
         <w:tc>
           <w:tcPr>
-            <w:tcW w:type="dxa" w:w="1656"/>
+            <w:tcW w:type="dxa" w:w="1419"/>
+          </w:tcPr>
+          <w:p>
+            <w:pPr>
+              <w:jc w:val="left"/>
+            </w:pPr>
+            <w:r>
+              <w:rPr>
+                <w:rFonts w:ascii="Calibri" w:hAnsi="Calibri"/>
+                <w:b w:val="0"/>
+                <w:i w:val="0"/>
+                <w:color w:val="18181B"/>
+                <w:sz w:val="17"/>
+              </w:rPr>
+              <w:t>1,750,000</w:t>
+            </w:r>
+          </w:p>
+        </w:tc>
+        <w:tc>
+          <w:tcPr>
+            <w:tcW w:type="dxa" w:w="1419"/>
+          </w:tcPr>
+          <w:p>
+            <w:pPr>
+              <w:jc w:val="left"/>
+            </w:pPr>
+            <w:r>
+              <w:rPr>
+                <w:rFonts w:ascii="Calibri" w:hAnsi="Calibri"/>
+                <w:b w:val="0"/>
+                <w:i w:val="0"/>
+                <w:color w:val="18181B"/>
+                <w:sz w:val="17"/>
+              </w:rPr>
+              <w:t>R$ 810,000.00</w:t>
+            </w:r>
+          </w:p>
+        </w:tc>
+        <w:tc>
+          <w:tcPr>
+            <w:tcW w:type="dxa" w:w="1419"/>
+          </w:tcPr>
+          <w:p>
+            <w:pPr>
+              <w:jc w:val="left"/>
+            </w:pPr>
+            <w:r>
+              <w:rPr>
+                <w:rFonts w:ascii="Calibri" w:hAnsi="Calibri"/>
+                <w:b w:val="0"/>
+                <w:i w:val="0"/>
+                <w:color w:val="18181B"/>
+                <w:sz w:val="17"/>
+              </w:rPr>
+              <w:t>R$ 1,316,250.00</w:t>
+            </w:r>
+          </w:p>
+        </w:tc>
+        <w:tc>
+          <w:tcPr>
+            <w:tcW w:type="dxa" w:w="1419"/>
+          </w:tcPr>
+          <w:p>
+            <w:pPr>
+              <w:jc w:val="left"/>
+            </w:pPr>
+            <w:r>
+              <w:rPr>
+                <w:rFonts w:ascii="Calibri" w:hAnsi="Calibri"/>
+                <w:b w:val="0"/>
+                <w:i w:val="0"/>
+                <w:color w:val="18181B"/>
+                <w:sz w:val="17"/>
+              </w:rPr>
+              <w:t>R$ 2,880,000.00</w:t>
+            </w:r>
+          </w:p>
+        </w:tc>
+        <w:tc>
+          <w:tcPr>
+            <w:tcW w:type="dxa" w:w="1419"/>
+          </w:tcPr>
+          <w:p>
+            <w:pPr>
+              <w:jc w:val="left"/>
+            </w:pPr>
+            <w:r>
+              <w:rPr>
+                <w:rFonts w:ascii="Calibri" w:hAnsi="Calibri"/>
+                <w:b w:val="0"/>
+                <w:i w:val="0"/>
+                <w:color w:val="18181B"/>
+                <w:sz w:val="17"/>
+              </w:rPr>
+              <w:t>R$ 4,196,250.00</w:t>
+            </w:r>
+          </w:p>
+        </w:tc>
+        <w:tc>
+          <w:tcPr>
+            <w:tcW w:type="dxa" w:w="1419"/>
+          </w:tcPr>
+          <w:p>
+            <w:pPr>
+              <w:jc w:val="left"/>
+            </w:pPr>
+            <w:r>
+              <w:rPr>
+                <w:rFonts w:ascii="Calibri" w:hAnsi="Calibri"/>
+                <w:b w:val="0"/>
+                <w:i w:val="0"/>
+                <w:color w:val="18181B"/>
+                <w:sz w:val="17"/>
+              </w:rPr>
+              <w:t>R$ 0.25</w:t>
+            </w:r>
+          </w:p>
+        </w:tc>
+      </w:tr>
+      <w:tr>
+        <w:tc>
+          <w:tcPr>
+            <w:tcW w:type="dxa" w:w="1419"/>
             <w:shd w:fill="F4F4F5"/>
           </w:tcPr>
           <w:p>
@@ -2787,15 +3179,15 @@
                 <w:b w:val="0"/>
                 <w:i w:val="0"/>
                 <w:color w:val="18181B"/>
-                <w:sz w:val="18"/>
+                <w:sz w:val="17"/>
               </w:rPr>
-              <w:t>R$ 1,352,227.50</w:t>
+              <w:t>2030</w:t>
             </w:r>
           </w:p>
         </w:tc>
         <w:tc>
           <w:tcPr>
-            <w:tcW w:type="dxa" w:w="1656"/>
+            <w:tcW w:type="dxa" w:w="1419"/>
             <w:shd w:fill="F4F4F5"/>
           </w:tcPr>
           <w:p>
@@ -2808,15 +3200,15 @@
                 <w:b w:val="0"/>
                 <w:i w:val="0"/>
                 <w:color w:val="18181B"/>
-                <w:sz w:val="18"/>
+                <w:sz w:val="17"/>
               </w:rPr>
-              <w:t>R$ 3,888,000.00</w:t>
+              <w:t>2,500,000</w:t>
             </w:r>
           </w:p>
         </w:tc>
         <w:tc>
           <w:tcPr>
-            <w:tcW w:type="dxa" w:w="1656"/>
+            <w:tcW w:type="dxa" w:w="1419"/>
             <w:shd w:fill="F4F4F5"/>
           </w:tcPr>
           <w:p>
@@ -2829,15 +3221,15 @@
                 <w:b w:val="0"/>
                 <w:i w:val="0"/>
                 <w:color w:val="18181B"/>
-                <w:sz w:val="18"/>
+                <w:sz w:val="17"/>
               </w:rPr>
-              <w:t>R$ 5,240,227.50</w:t>
+              <w:t>R$ 1,242,000.00</w:t>
             </w:r>
           </w:p>
         </w:tc>
         <w:tc>
           <w:tcPr>
-            <w:tcW w:type="dxa" w:w="1656"/>
+            <w:tcW w:type="dxa" w:w="1419"/>
             <w:shd w:fill="F4F4F5"/>
           </w:tcPr>
           <w:p>
@@ -2850,9 +3242,72 @@
                 <w:b w:val="0"/>
                 <w:i w:val="0"/>
                 <w:color w:val="18181B"/>
-                <w:sz w:val="18"/>
+                <w:sz w:val="17"/>
               </w:rPr>
-              <w:t>R$ 0.20</w:t>
+              <w:t>R$ 2,018,250.00</w:t>
+            </w:r>
+          </w:p>
+        </w:tc>
+        <w:tc>
+          <w:tcPr>
+            <w:tcW w:type="dxa" w:w="1419"/>
+            <w:shd w:fill="F4F4F5"/>
+          </w:tcPr>
+          <w:p>
+            <w:pPr>
+              <w:jc w:val="left"/>
+            </w:pPr>
+            <w:r>
+              <w:rPr>
+                <w:rFonts w:ascii="Calibri" w:hAnsi="Calibri"/>
+                <w:b w:val="0"/>
+                <w:i w:val="0"/>
+                <w:color w:val="18181B"/>
+                <w:sz w:val="17"/>
+              </w:rPr>
+              <w:t>R$ 3,888,000.00</w:t>
+            </w:r>
+          </w:p>
+        </w:tc>
+        <w:tc>
+          <w:tcPr>
+            <w:tcW w:type="dxa" w:w="1419"/>
+            <w:shd w:fill="F4F4F5"/>
+          </w:tcPr>
+          <w:p>
+            <w:pPr>
+              <w:jc w:val="left"/>
+            </w:pPr>
+            <w:r>
+              <w:rPr>
+                <w:rFonts w:ascii="Calibri" w:hAnsi="Calibri"/>
+                <w:b w:val="0"/>
+                <w:i w:val="0"/>
+                <w:color w:val="18181B"/>
+                <w:sz w:val="17"/>
+              </w:rPr>
+              <w:t>R$ 5,906,250.00</w:t>
+            </w:r>
+          </w:p>
+        </w:tc>
+        <w:tc>
+          <w:tcPr>
+            <w:tcW w:type="dxa" w:w="1419"/>
+            <w:shd w:fill="F4F4F5"/>
+          </w:tcPr>
+          <w:p>
+            <w:pPr>
+              <w:jc w:val="left"/>
+            </w:pPr>
+            <w:r>
+              <w:rPr>
+                <w:rFonts w:ascii="Calibri" w:hAnsi="Calibri"/>
+                <w:b w:val="0"/>
+                <w:i w:val="0"/>
+                <w:color w:val="18181B"/>
+                <w:sz w:val="17"/>
+              </w:rPr>
+              <w:t>R$ 0.23</w:t>
             </w:r>
           </w:p>
         </w:tc>

</xml_diff>